<commit_message>
readme - PROD (MINOR FIXES)
</commit_message>
<xml_diff>
--- a/readme.docx
+++ b/readme.docx
@@ -387,6 +387,17 @@
         <w:bidi/>
         <w:spacing w:line="276" w:lineRule="auto"/>
         <w:rPr>
+          <w:rFonts w:ascii="David" w:hAnsi="David" w:cs="David"/>
+          <w:b/>
+          <w:bCs/>
+          <w:sz w:val="32"/>
+          <w:szCs w:val="32"/>
+          <w:u w:val="single"/>
+          <w:rtl/>
+        </w:rPr>
+      </w:pPr>
+      <w:r>
+        <w:rPr>
           <w:rFonts w:ascii="David" w:hAnsi="David" w:cs="David" w:hint="cs"/>
           <w:b/>
           <w:bCs/>
@@ -395,7 +406,19 @@
           <w:u w:val="single"/>
           <w:rtl/>
         </w:rPr>
-      </w:pPr>
+        <w:t xml:space="preserve">מסלול </w:t>
+      </w:r>
+      <w:r>
+        <w:rPr>
+          <w:rFonts w:ascii="David" w:hAnsi="David" w:cs="David"/>
+          <w:b/>
+          <w:bCs/>
+          <w:sz w:val="32"/>
+          <w:szCs w:val="32"/>
+          <w:u w:val="single"/>
+        </w:rPr>
+        <w:t>PROD</w:t>
+      </w:r>
       <w:r>
         <w:rPr>
           <w:rFonts w:ascii="David" w:hAnsi="David" w:cs="David" w:hint="cs"/>
@@ -406,22 +429,1658 @@
           <w:u w:val="single"/>
           <w:rtl/>
         </w:rPr>
-        <w:t xml:space="preserve">מסלול </w:t>
-      </w:r>
-      <w:r>
+        <w:t xml:space="preserve"> - מומלץ</w:t>
+      </w:r>
+    </w:p>
+    <w:p>
+      <w:pPr>
+        <w:bidi/>
+        <w:spacing w:line="276" w:lineRule="auto"/>
         <w:rPr>
           <w:rFonts w:ascii="David" w:hAnsi="David" w:cs="David"/>
+          <w:u w:val="single"/>
+          <w:rtl/>
+        </w:rPr>
+      </w:pPr>
+      <w:r>
+        <w:rPr>
+          <w:rFonts w:ascii="David" w:hAnsi="David" w:cs="David" w:hint="cs"/>
+          <w:u w:val="single"/>
+          <w:rtl/>
+        </w:rPr>
+        <w:t>דרישות מקדימות:</w:t>
+      </w:r>
+    </w:p>
+    <w:p>
+      <w:pPr>
+        <w:pStyle w:val="ListParagraph"/>
+        <w:numPr>
+          <w:ilvl w:val="0"/>
+          <w:numId w:val="20"/>
+        </w:numPr>
+        <w:bidi/>
+        <w:spacing w:line="276" w:lineRule="auto"/>
+        <w:rPr>
+          <w:rFonts w:ascii="David" w:hAnsi="David" w:cs="David"/>
+        </w:rPr>
+      </w:pPr>
+      <w:r>
+        <w:rPr>
+          <w:rFonts w:ascii="David" w:hAnsi="David" w:cs="David"/>
+        </w:rPr>
+        <w:t>GIT</w:t>
+      </w:r>
+    </w:p>
+    <w:p>
+      <w:pPr>
+        <w:pStyle w:val="ListParagraph"/>
+        <w:numPr>
+          <w:ilvl w:val="0"/>
+          <w:numId w:val="20"/>
+        </w:numPr>
+        <w:bidi/>
+        <w:spacing w:line="276" w:lineRule="auto"/>
+        <w:rPr>
+          <w:rFonts w:ascii="David" w:hAnsi="David" w:cs="David"/>
+        </w:rPr>
+      </w:pPr>
+      <w:r>
+        <w:rPr>
+          <w:rFonts w:ascii="David" w:hAnsi="David" w:cs="David"/>
+        </w:rPr>
+        <w:t>DOCKER</w:t>
+      </w:r>
+      <w:r>
+        <w:rPr>
+          <w:rFonts w:ascii="David" w:hAnsi="David" w:cs="David" w:hint="cs"/>
+          <w:rtl/>
+        </w:rPr>
+        <w:t xml:space="preserve"> </w:t>
+      </w:r>
+      <w:r>
+        <w:rPr>
+          <w:rFonts w:ascii="David" w:hAnsi="David" w:cs="David"/>
+          <w:rtl/>
+        </w:rPr>
+        <w:t>–</w:t>
+      </w:r>
+      <w:r>
+        <w:rPr>
+          <w:rFonts w:ascii="David" w:hAnsi="David" w:cs="David" w:hint="cs"/>
+          <w:rtl/>
+        </w:rPr>
+        <w:t xml:space="preserve"> כולל </w:t>
+      </w:r>
+      <w:r>
+        <w:rPr>
+          <w:rFonts w:ascii="David" w:hAnsi="David" w:cs="David"/>
+        </w:rPr>
+        <w:t>COMPOSE</w:t>
+      </w:r>
+      <w:r>
+        <w:rPr>
+          <w:rFonts w:ascii="David" w:hAnsi="David" w:cs="David" w:hint="cs"/>
+          <w:rtl/>
+        </w:rPr>
+        <w:t xml:space="preserve"> גרסא 2 ומעלה (וגישה לאינטרנט לצורך הורדת ה</w:t>
+      </w:r>
+      <w:r>
+        <w:rPr>
+          <w:rFonts w:ascii="David" w:hAnsi="David" w:cs="David"/>
+        </w:rPr>
+        <w:t>IMAGES</w:t>
+      </w:r>
+      <w:r>
+        <w:rPr>
+          <w:rFonts w:ascii="David" w:hAnsi="David" w:cs="David" w:hint="cs"/>
+          <w:rtl/>
+        </w:rPr>
+        <w:t>).</w:t>
+      </w:r>
+    </w:p>
+    <w:p>
+      <w:pPr>
+        <w:bidi/>
+        <w:spacing w:line="276" w:lineRule="auto"/>
+        <w:rPr>
+          <w:rFonts w:ascii="David" w:hAnsi="David" w:cs="David"/>
+          <w:u w:val="single"/>
+        </w:rPr>
+      </w:pPr>
+      <w:r>
+        <w:rPr>
+          <w:rFonts w:ascii="David" w:hAnsi="David" w:cs="David" w:hint="cs"/>
+          <w:u w:val="single"/>
+          <w:rtl/>
+        </w:rPr>
+        <w:t>הקדמה</w:t>
+      </w:r>
+      <w:r>
+        <w:rPr>
+          <w:rFonts w:ascii="David" w:hAnsi="David" w:cs="David"/>
+          <w:u w:val="single"/>
+          <w:rtl/>
+        </w:rPr>
+        <w:t>:</w:t>
+      </w:r>
+    </w:p>
+    <w:p>
+      <w:pPr>
+        <w:bidi/>
+        <w:spacing w:line="276" w:lineRule="auto"/>
+        <w:rPr>
+          <w:rFonts w:ascii="David" w:eastAsia="Aptos" w:hAnsi="David" w:cs="David"/>
+          <w:rtl/>
+        </w:rPr>
+      </w:pPr>
+      <w:r>
+        <w:rPr>
+          <w:rFonts w:ascii="David" w:eastAsia="Aptos" w:hAnsi="David" w:cs="David" w:hint="cs"/>
+          <w:rtl/>
+        </w:rPr>
+        <w:t>בדרך זו, קיימים ל</w:t>
+      </w:r>
+      <w:r>
+        <w:rPr>
+          <w:rFonts w:ascii="David" w:eastAsia="Aptos" w:hAnsi="David" w:cs="David"/>
+        </w:rPr>
+        <w:t>REPOSITORIES</w:t>
+      </w:r>
+      <w:r>
+        <w:rPr>
+          <w:rFonts w:ascii="David" w:eastAsia="Aptos" w:hAnsi="David" w:cs="David" w:hint="cs"/>
+          <w:rtl/>
+        </w:rPr>
+        <w:t xml:space="preserve"> תהליכי </w:t>
+      </w:r>
+      <w:r>
+        <w:rPr>
+          <w:rFonts w:ascii="David" w:eastAsia="Aptos" w:hAnsi="David" w:cs="David"/>
+        </w:rPr>
+        <w:t>CI</w:t>
+      </w:r>
+      <w:r>
+        <w:rPr>
+          <w:rFonts w:ascii="David" w:eastAsia="Aptos" w:hAnsi="David" w:cs="David" w:hint="cs"/>
+          <w:rtl/>
+        </w:rPr>
+        <w:t xml:space="preserve"> שבונים את ה</w:t>
+      </w:r>
+      <w:r>
+        <w:rPr>
+          <w:rFonts w:ascii="David" w:eastAsia="Aptos" w:hAnsi="David" w:cs="David"/>
+        </w:rPr>
+        <w:t>DOCKER IMAGES</w:t>
+      </w:r>
+      <w:r>
+        <w:rPr>
+          <w:rFonts w:ascii="David" w:eastAsia="Aptos" w:hAnsi="David" w:cs="David" w:hint="cs"/>
+          <w:rtl/>
+        </w:rPr>
+        <w:t xml:space="preserve"> בכל דחיפה של קוד לענף </w:t>
+      </w:r>
+      <w:r>
+        <w:rPr>
+          <w:rFonts w:ascii="David" w:eastAsia="Aptos" w:hAnsi="David" w:cs="David"/>
+        </w:rPr>
+        <w:t>main</w:t>
+      </w:r>
+      <w:r>
+        <w:rPr>
+          <w:rFonts w:ascii="David" w:eastAsia="Aptos" w:hAnsi="David" w:cs="David" w:hint="cs"/>
+          <w:rtl/>
+        </w:rPr>
+        <w:t xml:space="preserve"> </w:t>
+      </w:r>
+      <w:r>
+        <w:rPr>
+          <w:rFonts w:ascii="David" w:eastAsia="Aptos" w:hAnsi="David" w:cs="David"/>
+          <w:rtl/>
+        </w:rPr>
+        <w:t>–</w:t>
+      </w:r>
+      <w:r>
+        <w:rPr>
+          <w:rFonts w:ascii="David" w:eastAsia="Aptos" w:hAnsi="David" w:cs="David" w:hint="cs"/>
+          <w:rtl/>
+        </w:rPr>
+        <w:t xml:space="preserve"> אנו נוריד ונפעיל אותם באמצעות </w:t>
+      </w:r>
+      <w:r>
+        <w:rPr>
+          <w:rFonts w:ascii="David" w:eastAsia="Aptos" w:hAnsi="David" w:cs="David"/>
+        </w:rPr>
+        <w:t>DOCKER COMPOSE</w:t>
+      </w:r>
+      <w:r>
+        <w:rPr>
+          <w:rFonts w:ascii="David" w:eastAsia="Aptos" w:hAnsi="David" w:cs="David" w:hint="cs"/>
+          <w:rtl/>
+        </w:rPr>
+        <w:t xml:space="preserve"> </w:t>
+      </w:r>
+      <w:r>
+        <w:rPr>
+          <w:rFonts w:ascii="David" w:eastAsia="Aptos" w:hAnsi="David" w:cs="David"/>
+          <w:rtl/>
+        </w:rPr>
+        <w:t>–</w:t>
+      </w:r>
+      <w:r>
+        <w:rPr>
+          <w:rFonts w:ascii="David" w:eastAsia="Aptos" w:hAnsi="David" w:cs="David" w:hint="cs"/>
+          <w:rtl/>
+        </w:rPr>
+        <w:t xml:space="preserve"> מריץ על אותה רשת פנימית את הפרוייקטים ומאפשר תקשורת ביניהם.</w:t>
+      </w:r>
+    </w:p>
+    <w:p>
+      <w:pPr>
+        <w:bidi/>
+        <w:spacing w:line="276" w:lineRule="auto"/>
+        <w:rPr>
+          <w:rFonts w:ascii="David" w:eastAsia="Aptos" w:hAnsi="David" w:cs="David"/>
+          <w:rtl/>
+        </w:rPr>
+      </w:pPr>
+      <w:r>
+        <w:rPr>
+          <w:rFonts w:ascii="David" w:eastAsia="Aptos" w:hAnsi="David" w:cs="David" w:hint="cs"/>
+          <w:rtl/>
+        </w:rPr>
+        <w:t xml:space="preserve">כמו-כן, </w:t>
+      </w:r>
+      <w:r>
+        <w:rPr>
+          <w:rFonts w:ascii="David" w:eastAsia="Aptos" w:hAnsi="David" w:cs="David" w:hint="cs"/>
+          <w:rtl/>
+        </w:rPr>
+        <w:t>בקובץ</w:t>
+      </w:r>
+      <w:r>
+        <w:rPr>
+          <w:rFonts w:ascii="David" w:eastAsia="Aptos" w:hAnsi="David" w:cs="David" w:hint="cs"/>
+          <w:rtl/>
+        </w:rPr>
+        <w:t xml:space="preserve"> ה</w:t>
+      </w:r>
+      <w:r>
+        <w:rPr>
+          <w:rFonts w:ascii="David" w:eastAsia="Aptos" w:hAnsi="David" w:cs="David"/>
+        </w:rPr>
+        <w:t>DOCKER COMPOSE</w:t>
+      </w:r>
+      <w:r>
+        <w:rPr>
+          <w:rFonts w:ascii="David" w:eastAsia="Aptos" w:hAnsi="David" w:cs="David" w:hint="cs"/>
+          <w:rtl/>
+        </w:rPr>
+        <w:t xml:space="preserve"> קיימים </w:t>
+      </w:r>
+      <w:r>
+        <w:rPr>
+          <w:rFonts w:ascii="David" w:eastAsia="Aptos" w:hAnsi="David" w:cs="David"/>
+        </w:rPr>
+        <w:t>VOLUMES</w:t>
+      </w:r>
+      <w:r>
+        <w:rPr>
+          <w:rFonts w:ascii="David" w:eastAsia="Aptos" w:hAnsi="David" w:cs="David" w:hint="cs"/>
+          <w:rtl/>
+        </w:rPr>
+        <w:t xml:space="preserve"> לצורך שמירה על מידע בין הרצות</w:t>
+      </w:r>
+      <w:r>
+        <w:rPr>
+          <w:rFonts w:ascii="David" w:eastAsia="Aptos" w:hAnsi="David" w:cs="David" w:hint="cs"/>
+          <w:rtl/>
+        </w:rPr>
+        <w:t xml:space="preserve"> </w:t>
+      </w:r>
+      <w:r>
+        <w:rPr>
+          <w:rFonts w:ascii="David" w:eastAsia="Aptos" w:hAnsi="David" w:cs="David"/>
+          <w:rtl/>
+        </w:rPr>
+        <w:t>–</w:t>
+      </w:r>
+      <w:r>
+        <w:rPr>
+          <w:rFonts w:ascii="David" w:eastAsia="Aptos" w:hAnsi="David" w:cs="David" w:hint="cs"/>
+          <w:rtl/>
+        </w:rPr>
+        <w:t xml:space="preserve"> יש לשים לב שמריצים (אם רוצים לשמור על אותו מידע) עם אותם ההפניות.</w:t>
+      </w:r>
+    </w:p>
+    <w:p>
+      <w:pPr>
+        <w:bidi/>
+        <w:spacing w:line="276" w:lineRule="auto"/>
+        <w:rPr>
+          <w:rFonts w:ascii="David" w:eastAsia="Aptos" w:hAnsi="David" w:cs="David" w:hint="cs"/>
+          <w:rtl/>
+        </w:rPr>
+      </w:pPr>
+      <w:r>
+        <w:rPr>
+          <w:rFonts w:ascii="David" w:eastAsia="Aptos" w:hAnsi="David" w:cs="David" w:hint="cs"/>
+          <w:rtl/>
+        </w:rPr>
+        <w:t xml:space="preserve">ניתן לשנות אם נדרש את שמות ומסלולי קבצי </w:t>
+      </w:r>
+      <w:r>
+        <w:rPr>
+          <w:rFonts w:ascii="David" w:eastAsia="Aptos" w:hAnsi="David" w:cs="David"/>
+        </w:rPr>
+        <w:t>.env</w:t>
+      </w:r>
+      <w:r>
+        <w:rPr>
+          <w:rFonts w:ascii="David" w:eastAsia="Aptos" w:hAnsi="David" w:cs="David" w:hint="cs"/>
+          <w:rtl/>
+        </w:rPr>
+        <w:t xml:space="preserve"> או את ה</w:t>
+      </w:r>
+      <w:r>
+        <w:rPr>
+          <w:rFonts w:ascii="David" w:eastAsia="Aptos" w:hAnsi="David" w:cs="David"/>
+        </w:rPr>
+        <w:t>VOLUMES</w:t>
+      </w:r>
+      <w:r>
+        <w:rPr>
+          <w:rFonts w:ascii="David" w:eastAsia="Aptos" w:hAnsi="David" w:cs="David" w:hint="cs"/>
+          <w:rtl/>
+        </w:rPr>
+        <w:t xml:space="preserve"> בקובץ ה</w:t>
+      </w:r>
+      <w:r>
+        <w:rPr>
+          <w:rFonts w:ascii="David" w:eastAsia="Aptos" w:hAnsi="David" w:cs="David"/>
+        </w:rPr>
+        <w:t>DOCKER COMPOSE</w:t>
+      </w:r>
+      <w:r>
+        <w:rPr>
+          <w:rFonts w:ascii="David" w:eastAsia="Aptos" w:hAnsi="David" w:cs="David" w:hint="cs"/>
+          <w:rtl/>
+        </w:rPr>
+        <w:t xml:space="preserve"> עצמו</w:t>
+      </w:r>
+    </w:p>
+    <w:p>
+      <w:pPr>
+        <w:bidi/>
+        <w:spacing w:line="276" w:lineRule="auto"/>
+        <w:rPr>
+          <w:rFonts w:ascii="David" w:hAnsi="David" w:cs="David"/>
+          <w:u w:val="single"/>
+          <w:rtl/>
+        </w:rPr>
+      </w:pPr>
+      <w:r>
+        <w:rPr>
+          <w:rFonts w:ascii="David" w:hAnsi="David" w:cs="David" w:hint="cs"/>
+          <w:u w:val="single"/>
+          <w:rtl/>
+        </w:rPr>
+        <w:t>שלב 1:</w:t>
+      </w:r>
+    </w:p>
+    <w:p>
+      <w:pPr>
+        <w:bidi/>
+        <w:spacing w:line="276" w:lineRule="auto"/>
+        <w:rPr>
+          <w:rFonts w:ascii="David" w:hAnsi="David" w:cs="David"/>
+          <w:rtl/>
+        </w:rPr>
+      </w:pPr>
+      <w:r>
+        <w:rPr>
+          <w:rFonts w:ascii="David" w:hAnsi="David" w:cs="David" w:hint="cs"/>
+          <w:rtl/>
+        </w:rPr>
+        <w:t xml:space="preserve">יש להוריד או לעשות </w:t>
+      </w:r>
+      <w:r>
+        <w:rPr>
+          <w:rFonts w:ascii="David" w:hAnsi="David" w:cs="David"/>
+        </w:rPr>
+        <w:t>CLONE</w:t>
+      </w:r>
+      <w:r>
+        <w:rPr>
+          <w:rFonts w:ascii="David" w:hAnsi="David" w:cs="David" w:hint="cs"/>
+          <w:rtl/>
+        </w:rPr>
+        <w:t xml:space="preserve"> לפרוייקטים הבאים:</w:t>
+      </w:r>
+    </w:p>
+    <w:p>
+      <w:pPr>
+        <w:spacing w:before="100" w:beforeAutospacing="1" w:after="100" w:afterAutospacing="1" w:line="240" w:lineRule="auto"/>
+        <w:rPr>
+          <w:rFonts w:ascii="Times New Roman" w:eastAsia="Times New Roman" w:hAnsi="Times New Roman" w:cs="Times New Roman"/>
+          <w:kern w:val="0"/>
+          <w14:ligatures w14:val="none"/>
+        </w:rPr>
+      </w:pPr>
+      <w:r>
+        <w:rPr>
+          <w:rFonts w:ascii="Courier New" w:eastAsia="Times New Roman" w:hAnsi="Courier New" w:cs="Courier New"/>
+          <w:kern w:val="0"/>
+          <w:sz w:val="20"/>
+          <w:szCs w:val="20"/>
+          <w14:ligatures w14:val="none"/>
+        </w:rPr>
+        <w:t>https://github.com/liranbat/sportshop-backend.git</w:t>
+      </w:r>
+    </w:p>
+    <w:p>
+      <w:pPr>
+        <w:spacing w:before="100" w:beforeAutospacing="1" w:after="100" w:afterAutospacing="1" w:line="240" w:lineRule="auto"/>
+        <w:rPr>
+          <w:rFonts w:ascii="Times New Roman" w:eastAsia="Times New Roman" w:hAnsi="Times New Roman" w:cs="Times New Roman"/>
+          <w:kern w:val="0"/>
+          <w14:ligatures w14:val="none"/>
+        </w:rPr>
+      </w:pPr>
+      <w:r>
+        <w:rPr>
+          <w:rFonts w:ascii="Courier New" w:eastAsia="Times New Roman" w:hAnsi="Courier New" w:cs="Courier New"/>
+          <w:kern w:val="0"/>
+          <w:sz w:val="20"/>
+          <w:szCs w:val="20"/>
+          <w14:ligatures w14:val="none"/>
+        </w:rPr>
+        <w:t>https://github.com/liranbat/sportshop-frontend.git</w:t>
+      </w:r>
+    </w:p>
+    <w:p>
+      <w:pPr>
+        <w:spacing w:before="100" w:beforeAutospacing="1" w:after="100" w:afterAutospacing="1" w:line="240" w:lineRule="auto"/>
+        <w:rPr>
+          <w:rFonts w:ascii="Times New Roman" w:eastAsia="Times New Roman" w:hAnsi="Times New Roman" w:cs="Times New Roman"/>
+          <w:kern w:val="0"/>
+          <w:rtl/>
+          <w14:ligatures w14:val="none"/>
+        </w:rPr>
+      </w:pPr>
+      <w:r>
+        <w:rPr>
+          <w:rFonts w:ascii="Courier New" w:eastAsia="Times New Roman" w:hAnsi="Courier New" w:cs="Courier New"/>
+          <w:kern w:val="0"/>
+          <w:sz w:val="20"/>
+          <w:szCs w:val="20"/>
+          <w14:ligatures w14:val="none"/>
+        </w:rPr>
+        <w:t>https://github.com/liranbat/sportshop-deploy.git</w:t>
+      </w:r>
+    </w:p>
+    <w:p>
+      <w:pPr>
+        <w:bidi/>
+        <w:spacing w:line="276" w:lineRule="auto"/>
+        <w:rPr>
+          <w:rFonts w:ascii="David" w:hAnsi="David" w:cs="David"/>
+          <w:rtl/>
+        </w:rPr>
+      </w:pPr>
+      <w:r>
+        <w:rPr>
+          <w:rFonts w:ascii="David" w:hAnsi="David" w:cs="David" w:hint="cs"/>
+          <w:rtl/>
+        </w:rPr>
+        <w:t>ליצור תיקיה אחת מעליהם שיראה כך:</w:t>
+      </w:r>
+    </w:p>
+    <w:p>
+      <w:pPr>
+        <w:bidi/>
+        <w:spacing w:line="276" w:lineRule="auto"/>
+        <w:jc w:val="right"/>
+        <w:rPr>
+          <w:rFonts w:ascii="David" w:hAnsi="David" w:cs="David"/>
+        </w:rPr>
+      </w:pPr>
+      <w:proofErr w:type="spellStart"/>
+      <w:r>
+        <w:rPr>
+          <w:rFonts w:ascii="David" w:hAnsi="David" w:cs="David"/>
+        </w:rPr>
+        <w:t>Parent_folder</w:t>
+      </w:r>
+      <w:proofErr w:type="spellEnd"/>
+      <w:r>
+        <w:rPr>
+          <w:rFonts w:ascii="David" w:hAnsi="David" w:cs="David"/>
+        </w:rPr>
+        <w:t xml:space="preserve"> /</w:t>
+      </w:r>
+    </w:p>
+    <w:p>
+      <w:pPr>
+        <w:bidi/>
+        <w:spacing w:line="276" w:lineRule="auto"/>
+        <w:jc w:val="right"/>
+        <w:rPr>
+          <w:rFonts w:ascii="David" w:hAnsi="David" w:cs="David"/>
+        </w:rPr>
+      </w:pPr>
+      <w:r>
+        <w:rPr>
+          <w:rFonts w:ascii="David" w:hAnsi="David" w:cs="David"/>
+        </w:rPr>
+        <w:t xml:space="preserve">|---- </w:t>
+      </w:r>
+      <w:proofErr w:type="spellStart"/>
+      <w:r>
+        <w:rPr>
+          <w:rFonts w:ascii="David" w:hAnsi="David" w:cs="David"/>
+        </w:rPr>
+        <w:t>sportshop</w:t>
+      </w:r>
+      <w:proofErr w:type="spellEnd"/>
+      <w:r>
+        <w:rPr>
+          <w:rFonts w:ascii="David" w:hAnsi="David" w:cs="David"/>
+        </w:rPr>
+        <w:t>-backend/</w:t>
+      </w:r>
+    </w:p>
+    <w:p>
+      <w:pPr>
+        <w:bidi/>
+        <w:spacing w:line="276" w:lineRule="auto"/>
+        <w:jc w:val="right"/>
+        <w:rPr>
+          <w:rFonts w:ascii="David" w:hAnsi="David" w:cs="David"/>
+        </w:rPr>
+      </w:pPr>
+      <w:r>
+        <w:rPr>
+          <w:rFonts w:ascii="David" w:hAnsi="David" w:cs="David"/>
+        </w:rPr>
+        <w:t xml:space="preserve">|---- </w:t>
+      </w:r>
+      <w:proofErr w:type="spellStart"/>
+      <w:r>
+        <w:rPr>
+          <w:rFonts w:ascii="David" w:hAnsi="David" w:cs="David"/>
+        </w:rPr>
+        <w:t>sportshop</w:t>
+      </w:r>
+      <w:proofErr w:type="spellEnd"/>
+      <w:r>
+        <w:rPr>
+          <w:rFonts w:ascii="David" w:hAnsi="David" w:cs="David"/>
+        </w:rPr>
+        <w:t>-</w:t>
+      </w:r>
+      <w:r>
+        <w:rPr>
+          <w:rFonts w:ascii="David" w:hAnsi="David" w:cs="David"/>
+        </w:rPr>
+        <w:t>frontend</w:t>
+      </w:r>
+      <w:r>
+        <w:rPr>
+          <w:rFonts w:ascii="David" w:hAnsi="David" w:cs="David"/>
+        </w:rPr>
+        <w:t>/</w:t>
+      </w:r>
+    </w:p>
+    <w:p>
+      <w:pPr>
+        <w:bidi/>
+        <w:spacing w:line="276" w:lineRule="auto"/>
+        <w:jc w:val="right"/>
+        <w:rPr>
+          <w:rFonts w:ascii="David" w:hAnsi="David" w:cs="David"/>
+        </w:rPr>
+      </w:pPr>
+      <w:r>
+        <w:rPr>
+          <w:rFonts w:ascii="David" w:hAnsi="David" w:cs="David"/>
+        </w:rPr>
+        <w:t xml:space="preserve">|---- </w:t>
+      </w:r>
+      <w:proofErr w:type="spellStart"/>
+      <w:r>
+        <w:rPr>
+          <w:rFonts w:ascii="David" w:hAnsi="David" w:cs="David"/>
+        </w:rPr>
+        <w:t>sportshop</w:t>
+      </w:r>
+      <w:proofErr w:type="spellEnd"/>
+      <w:r>
+        <w:rPr>
+          <w:rFonts w:ascii="David" w:hAnsi="David" w:cs="David"/>
+        </w:rPr>
+        <w:t>-</w:t>
+      </w:r>
+      <w:r>
+        <w:rPr>
+          <w:rFonts w:ascii="David" w:hAnsi="David" w:cs="David"/>
+        </w:rPr>
+        <w:t>deploy</w:t>
+      </w:r>
+      <w:r>
+        <w:rPr>
+          <w:rFonts w:ascii="David" w:hAnsi="David" w:cs="David"/>
+        </w:rPr>
+        <w:t>/</w:t>
+      </w:r>
+    </w:p>
+    <w:p>
+      <w:pPr>
+        <w:bidi/>
+        <w:spacing w:line="276" w:lineRule="auto"/>
+        <w:rPr>
+          <w:rFonts w:ascii="David" w:hAnsi="David" w:cs="David"/>
+          <w:u w:val="single"/>
+        </w:rPr>
+      </w:pPr>
+      <w:r>
+        <w:rPr>
+          <w:rFonts w:ascii="David" w:hAnsi="David" w:cs="David"/>
+          <w:u w:val="single"/>
+          <w:rtl/>
+        </w:rPr>
+        <w:t xml:space="preserve">שלב </w:t>
+      </w:r>
+      <w:r>
+        <w:rPr>
+          <w:rFonts w:ascii="David" w:hAnsi="David" w:cs="David" w:hint="cs"/>
+          <w:u w:val="single"/>
+          <w:rtl/>
+        </w:rPr>
+        <w:t>2:</w:t>
+      </w:r>
+    </w:p>
+    <w:p>
+      <w:pPr>
+        <w:bidi/>
+        <w:spacing w:line="276" w:lineRule="auto"/>
+        <w:rPr>
+          <w:rFonts w:ascii="David" w:eastAsia="Aptos" w:hAnsi="David" w:cs="David"/>
+          <w:rtl/>
+        </w:rPr>
+      </w:pPr>
+      <w:r>
+        <w:rPr>
+          <w:rFonts w:ascii="David" w:eastAsia="Aptos" w:hAnsi="David" w:cs="David" w:hint="cs"/>
+          <w:rtl/>
+        </w:rPr>
+        <w:t>בתוך כל אחד מ-3 ה</w:t>
+      </w:r>
+      <w:r>
+        <w:rPr>
+          <w:rFonts w:ascii="David" w:eastAsia="Aptos" w:hAnsi="David" w:cs="David"/>
+        </w:rPr>
+        <w:t>REPO</w:t>
+      </w:r>
+      <w:r>
+        <w:rPr>
+          <w:rFonts w:ascii="David" w:eastAsia="Aptos" w:hAnsi="David" w:cs="David" w:hint="cs"/>
+          <w:rtl/>
+        </w:rPr>
+        <w:t xml:space="preserve"> קיימם קובץ </w:t>
+      </w:r>
+      <w:r>
+        <w:rPr>
+          <w:rFonts w:ascii="David" w:eastAsia="Aptos" w:hAnsi="David" w:cs="David"/>
+        </w:rPr>
+        <w:t>.</w:t>
+      </w:r>
+      <w:proofErr w:type="spellStart"/>
+      <w:r>
+        <w:rPr>
+          <w:rFonts w:ascii="David" w:eastAsia="Aptos" w:hAnsi="David" w:cs="David"/>
+        </w:rPr>
+        <w:t>env.prod.example</w:t>
+      </w:r>
+      <w:proofErr w:type="spellEnd"/>
+      <w:r>
+        <w:rPr>
+          <w:rFonts w:ascii="David" w:eastAsia="Aptos" w:hAnsi="David" w:cs="David" w:hint="cs"/>
+          <w:rtl/>
+        </w:rPr>
+        <w:t xml:space="preserve"> </w:t>
+      </w:r>
+      <w:r>
+        <w:rPr>
+          <w:rFonts w:ascii="David" w:eastAsia="Aptos" w:hAnsi="David" w:cs="David"/>
+          <w:rtl/>
+        </w:rPr>
+        <w:t>–</w:t>
+      </w:r>
+      <w:r>
+        <w:rPr>
+          <w:rFonts w:ascii="David" w:eastAsia="Aptos" w:hAnsi="David" w:cs="David" w:hint="cs"/>
+          <w:rtl/>
+        </w:rPr>
+        <w:t xml:space="preserve"> יש להעתיק ולהדביק תחת אותו ה</w:t>
+      </w:r>
+      <w:r>
+        <w:rPr>
+          <w:rFonts w:ascii="David" w:eastAsia="Aptos" w:hAnsi="David" w:cs="David"/>
+        </w:rPr>
+        <w:t>REPO</w:t>
+      </w:r>
+      <w:r>
+        <w:rPr>
+          <w:rFonts w:ascii="David" w:eastAsia="Aptos" w:hAnsi="David" w:cs="David" w:hint="cs"/>
+          <w:rtl/>
+        </w:rPr>
+        <w:t xml:space="preserve"> ולשנות את השם ל-</w:t>
+      </w:r>
+      <w:r>
+        <w:rPr>
+          <w:rFonts w:ascii="David" w:eastAsia="Aptos" w:hAnsi="David" w:cs="David"/>
+        </w:rPr>
+        <w:t xml:space="preserve"> .</w:t>
+      </w:r>
+      <w:proofErr w:type="spellStart"/>
+      <w:r>
+        <w:rPr>
+          <w:rFonts w:ascii="David" w:eastAsia="Aptos" w:hAnsi="David" w:cs="David"/>
+        </w:rPr>
+        <w:t>env.prod</w:t>
+      </w:r>
+      <w:proofErr w:type="spellEnd"/>
+      <w:r>
+        <w:rPr>
+          <w:rFonts w:ascii="David" w:eastAsia="Aptos" w:hAnsi="David" w:cs="David" w:hint="cs"/>
+          <w:rtl/>
+        </w:rPr>
+        <w:t xml:space="preserve"> (בתוך </w:t>
+      </w:r>
+      <w:r>
+        <w:rPr>
+          <w:rFonts w:ascii="David" w:eastAsia="Aptos" w:hAnsi="David" w:cs="David"/>
+        </w:rPr>
+        <w:t>REPO</w:t>
+      </w:r>
+      <w:r>
+        <w:rPr>
+          <w:rFonts w:ascii="David" w:eastAsia="Aptos" w:hAnsi="David" w:cs="David" w:hint="cs"/>
+          <w:rtl/>
+        </w:rPr>
+        <w:t xml:space="preserve"> של </w:t>
+      </w:r>
+      <w:r>
+        <w:rPr>
+          <w:rFonts w:ascii="David" w:eastAsia="Aptos" w:hAnsi="David" w:cs="David"/>
+        </w:rPr>
+        <w:t>deploy</w:t>
+      </w:r>
+      <w:r>
+        <w:rPr>
+          <w:rFonts w:ascii="David" w:eastAsia="Aptos" w:hAnsi="David" w:cs="David" w:hint="cs"/>
+          <w:rtl/>
+        </w:rPr>
+        <w:t xml:space="preserve"> השמות צריכים להיות </w:t>
+      </w:r>
+      <w:r>
+        <w:rPr>
+          <w:rFonts w:ascii="David" w:eastAsia="Aptos" w:hAnsi="David" w:cs="David"/>
+        </w:rPr>
+        <w:t>.</w:t>
+      </w:r>
+      <w:proofErr w:type="spellStart"/>
+      <w:r>
+        <w:rPr>
+          <w:rFonts w:ascii="David" w:eastAsia="Aptos" w:hAnsi="David" w:cs="David"/>
+        </w:rPr>
+        <w:t>env.pro</w:t>
+      </w:r>
+      <w:r>
+        <w:rPr>
+          <w:rFonts w:ascii="David" w:eastAsia="Aptos" w:hAnsi="David" w:cs="David"/>
+        </w:rPr>
+        <w:t>d.db.example</w:t>
+      </w:r>
+      <w:proofErr w:type="spellEnd"/>
+      <w:r>
+        <w:rPr>
+          <w:rFonts w:ascii="David" w:eastAsia="Aptos" w:hAnsi="David" w:cs="David" w:hint="cs"/>
+          <w:rtl/>
+        </w:rPr>
+        <w:t xml:space="preserve"> ו- </w:t>
+      </w:r>
+      <w:r>
+        <w:rPr>
+          <w:rFonts w:ascii="David" w:eastAsia="Aptos" w:hAnsi="David" w:cs="David"/>
+        </w:rPr>
+        <w:t>.</w:t>
+      </w:r>
+      <w:proofErr w:type="spellStart"/>
+      <w:r>
+        <w:rPr>
+          <w:rFonts w:ascii="David" w:eastAsia="Aptos" w:hAnsi="David" w:cs="David"/>
+        </w:rPr>
+        <w:t>env.prod.db</w:t>
+      </w:r>
+      <w:proofErr w:type="spellEnd"/>
+      <w:r>
+        <w:rPr>
+          <w:rFonts w:ascii="David" w:eastAsia="Aptos" w:hAnsi="David" w:cs="David" w:hint="cs"/>
+          <w:rtl/>
+        </w:rPr>
+        <w:t>).</w:t>
+      </w:r>
+    </w:p>
+    <w:p>
+      <w:pPr>
+        <w:bidi/>
+        <w:spacing w:line="276" w:lineRule="auto"/>
+        <w:rPr>
+          <w:rFonts w:ascii="David" w:eastAsia="Aptos" w:hAnsi="David" w:cs="David"/>
+          <w:rtl/>
+        </w:rPr>
+      </w:pPr>
+      <w:r>
+        <w:rPr>
+          <w:rFonts w:ascii="David" w:eastAsia="Aptos" w:hAnsi="David" w:cs="David" w:hint="cs"/>
+          <w:rtl/>
+        </w:rPr>
+        <w:t xml:space="preserve">עבור </w:t>
+      </w:r>
+      <w:r>
+        <w:rPr>
+          <w:rFonts w:ascii="David" w:eastAsia="Aptos" w:hAnsi="David" w:cs="David"/>
+          <w:u w:val="single"/>
+        </w:rPr>
+        <w:t>deploy</w:t>
+      </w:r>
+      <w:r>
+        <w:rPr>
+          <w:rFonts w:ascii="David" w:eastAsia="Aptos" w:hAnsi="David" w:cs="David" w:hint="cs"/>
+          <w:rtl/>
+        </w:rPr>
+        <w:t xml:space="preserve"> יש לשנות ערכים עבור </w:t>
+      </w:r>
+      <w:r>
+        <w:rPr>
+          <w:rFonts w:ascii="David" w:eastAsia="Aptos" w:hAnsi="David" w:cs="David"/>
+        </w:rPr>
+        <w:t>DB</w:t>
+      </w:r>
+      <w:r>
+        <w:rPr>
+          <w:rFonts w:ascii="David" w:eastAsia="Aptos" w:hAnsi="David" w:cs="David" w:hint="cs"/>
+          <w:rtl/>
+        </w:rPr>
+        <w:t>:</w:t>
+      </w:r>
+    </w:p>
+    <w:p>
+      <w:pPr>
+        <w:bidi/>
+        <w:spacing w:line="276" w:lineRule="auto"/>
+        <w:rPr>
+          <w:rFonts w:ascii="David" w:eastAsia="Aptos" w:hAnsi="David" w:cs="David"/>
+        </w:rPr>
+      </w:pPr>
+      <w:r>
+        <w:rPr>
+          <w:rFonts w:ascii="David" w:eastAsia="Aptos" w:hAnsi="David" w:cs="David"/>
+        </w:rPr>
+        <w:t>POSTGRES_DB</w:t>
+      </w:r>
+    </w:p>
+    <w:p>
+      <w:pPr>
+        <w:bidi/>
+        <w:spacing w:line="276" w:lineRule="auto"/>
+        <w:rPr>
+          <w:rFonts w:ascii="David" w:eastAsia="Aptos" w:hAnsi="David" w:cs="David"/>
+          <w:rtl/>
+        </w:rPr>
+      </w:pPr>
+      <w:r>
+        <w:rPr>
+          <w:rFonts w:ascii="David" w:eastAsia="Aptos" w:hAnsi="David" w:cs="David"/>
+        </w:rPr>
+        <w:t>POSTGRES_PASSWORD</w:t>
+      </w:r>
+    </w:p>
+    <w:p>
+      <w:pPr>
+        <w:bidi/>
+        <w:spacing w:line="276" w:lineRule="auto"/>
+        <w:rPr>
+          <w:rFonts w:ascii="David" w:eastAsia="Aptos" w:hAnsi="David" w:cs="David"/>
+        </w:rPr>
+      </w:pPr>
+      <w:r>
+        <w:rPr>
+          <w:rFonts w:ascii="David" w:eastAsia="Aptos" w:hAnsi="David" w:cs="David"/>
+        </w:rPr>
+        <w:t>POSTGRES_USER</w:t>
+      </w:r>
+    </w:p>
+    <w:p>
+      <w:pPr>
+        <w:bidi/>
+        <w:spacing w:line="276" w:lineRule="auto"/>
+        <w:rPr>
+          <w:rFonts w:ascii="David" w:eastAsia="Aptos" w:hAnsi="David" w:cs="David"/>
+          <w:rtl/>
+        </w:rPr>
+      </w:pPr>
+      <w:r>
+        <w:rPr>
+          <w:rFonts w:ascii="David" w:eastAsia="Aptos" w:hAnsi="David" w:cs="David" w:hint="cs"/>
+          <w:rtl/>
+        </w:rPr>
+        <w:lastRenderedPageBreak/>
+        <w:t>ערכים אלו הם שם ה</w:t>
+      </w:r>
+      <w:r>
+        <w:rPr>
+          <w:rFonts w:ascii="David" w:eastAsia="Aptos" w:hAnsi="David" w:cs="David"/>
+        </w:rPr>
+        <w:t>DB</w:t>
+      </w:r>
+      <w:r>
+        <w:rPr>
+          <w:rFonts w:ascii="David" w:eastAsia="Aptos" w:hAnsi="David" w:cs="David" w:hint="cs"/>
+          <w:rtl/>
+        </w:rPr>
+        <w:t xml:space="preserve"> ופרטי המשתמש לצורך גישה אליו שאיתו יעלה ה</w:t>
+      </w:r>
+      <w:r>
+        <w:rPr>
+          <w:rFonts w:ascii="David" w:eastAsia="Aptos" w:hAnsi="David" w:cs="David"/>
+        </w:rPr>
+        <w:t>DB</w:t>
+      </w:r>
+      <w:r>
+        <w:rPr>
+          <w:rFonts w:ascii="David" w:eastAsia="Aptos" w:hAnsi="David" w:cs="David" w:hint="cs"/>
+          <w:rtl/>
+        </w:rPr>
+        <w:t xml:space="preserve"> באמצעות ה</w:t>
+      </w:r>
+      <w:r>
+        <w:rPr>
+          <w:rFonts w:ascii="David" w:eastAsia="Aptos" w:hAnsi="David" w:cs="David"/>
+        </w:rPr>
+        <w:t>DOCKER</w:t>
+      </w:r>
+      <w:r>
+        <w:rPr>
+          <w:rFonts w:ascii="David" w:eastAsia="Aptos" w:hAnsi="David" w:cs="David" w:hint="cs"/>
+          <w:rtl/>
+        </w:rPr>
+        <w:t xml:space="preserve"> </w:t>
+      </w:r>
+      <w:r>
+        <w:rPr>
+          <w:rFonts w:ascii="David" w:eastAsia="Aptos" w:hAnsi="David" w:cs="David"/>
+          <w:rtl/>
+        </w:rPr>
+        <w:t>–</w:t>
+      </w:r>
+      <w:r>
+        <w:rPr>
+          <w:rFonts w:ascii="David" w:eastAsia="Aptos" w:hAnsi="David" w:cs="David" w:hint="cs"/>
+          <w:rtl/>
+        </w:rPr>
+        <w:t xml:space="preserve"> הגדרת </w:t>
+      </w:r>
+      <w:r>
+        <w:rPr>
+          <w:rFonts w:ascii="David" w:eastAsia="Aptos" w:hAnsi="David" w:cs="David"/>
+        </w:rPr>
+        <w:t>DB</w:t>
+      </w:r>
+      <w:r>
+        <w:rPr>
+          <w:rFonts w:ascii="David" w:eastAsia="Aptos" w:hAnsi="David" w:cs="David" w:hint="cs"/>
+          <w:rtl/>
+        </w:rPr>
+        <w:t>.</w:t>
+      </w:r>
+    </w:p>
+    <w:p>
+      <w:pPr>
+        <w:bidi/>
+        <w:spacing w:line="276" w:lineRule="auto"/>
+        <w:rPr>
+          <w:rFonts w:ascii="David" w:eastAsia="Aptos" w:hAnsi="David" w:cs="David"/>
+          <w:rtl/>
+        </w:rPr>
+      </w:pPr>
+    </w:p>
+    <w:p>
+      <w:pPr>
+        <w:bidi/>
+        <w:spacing w:line="276" w:lineRule="auto"/>
+        <w:rPr>
+          <w:rFonts w:ascii="David" w:eastAsia="Aptos" w:hAnsi="David" w:cs="David"/>
+          <w:rtl/>
+        </w:rPr>
+      </w:pPr>
+      <w:r>
+        <w:rPr>
+          <w:rFonts w:ascii="David" w:eastAsia="Aptos" w:hAnsi="David" w:cs="David" w:hint="cs"/>
+          <w:rtl/>
+        </w:rPr>
+        <w:t xml:space="preserve">עבור </w:t>
+      </w:r>
+      <w:r>
+        <w:rPr>
+          <w:rFonts w:ascii="David" w:eastAsia="Aptos" w:hAnsi="David" w:cs="David"/>
+          <w:u w:val="single"/>
+        </w:rPr>
+        <w:t>frontend</w:t>
+      </w:r>
+      <w:r>
+        <w:rPr>
+          <w:rFonts w:ascii="David" w:eastAsia="Aptos" w:hAnsi="David" w:cs="David" w:hint="cs"/>
+          <w:rtl/>
+        </w:rPr>
+        <w:t xml:space="preserve"> אין צורך לשנות שום דבר</w:t>
+      </w:r>
+      <w:r>
+        <w:rPr>
+          <w:rFonts w:ascii="David" w:eastAsia="Aptos" w:hAnsi="David" w:cs="David" w:hint="cs"/>
+          <w:rtl/>
+        </w:rPr>
+        <w:t xml:space="preserve"> </w:t>
+      </w:r>
+      <w:r>
+        <w:rPr>
+          <w:rFonts w:ascii="David" w:eastAsia="Aptos" w:hAnsi="David" w:cs="David"/>
+          <w:rtl/>
+        </w:rPr>
+        <w:t>–</w:t>
+      </w:r>
+      <w:r>
+        <w:rPr>
+          <w:rFonts w:ascii="David" w:eastAsia="Aptos" w:hAnsi="David" w:cs="David" w:hint="cs"/>
+          <w:rtl/>
+        </w:rPr>
+        <w:t xml:space="preserve"> הכול כבר מותאם.</w:t>
+      </w:r>
+    </w:p>
+    <w:p>
+      <w:pPr>
+        <w:bidi/>
+        <w:spacing w:line="276" w:lineRule="auto"/>
+        <w:rPr>
+          <w:rFonts w:ascii="David" w:eastAsia="Aptos" w:hAnsi="David" w:cs="David"/>
+          <w:rtl/>
+        </w:rPr>
+      </w:pPr>
+      <w:r>
+        <w:rPr>
+          <w:rFonts w:ascii="David" w:eastAsia="Aptos" w:hAnsi="David" w:cs="David" w:hint="cs"/>
+          <w:rtl/>
+        </w:rPr>
+        <w:t xml:space="preserve">עבור </w:t>
+      </w:r>
+      <w:r>
+        <w:rPr>
+          <w:rFonts w:ascii="David" w:eastAsia="Aptos" w:hAnsi="David" w:cs="David"/>
+          <w:u w:val="single"/>
+        </w:rPr>
+        <w:t>backend</w:t>
+      </w:r>
+      <w:r>
+        <w:rPr>
+          <w:rFonts w:ascii="David" w:eastAsia="Aptos" w:hAnsi="David" w:cs="David" w:hint="cs"/>
+          <w:rtl/>
+        </w:rPr>
+        <w:t xml:space="preserve"> יש לשנות ערכים עבור </w:t>
+      </w:r>
+      <w:r>
+        <w:rPr>
+          <w:rFonts w:ascii="David" w:eastAsia="Aptos" w:hAnsi="David" w:cs="David"/>
+        </w:rPr>
+        <w:t>DB</w:t>
+      </w:r>
+      <w:r>
+        <w:rPr>
+          <w:rFonts w:ascii="David" w:eastAsia="Aptos" w:hAnsi="David" w:cs="David" w:hint="cs"/>
+          <w:rtl/>
+        </w:rPr>
+        <w:t>:</w:t>
+      </w:r>
+    </w:p>
+    <w:p>
+      <w:pPr>
+        <w:bidi/>
+        <w:spacing w:line="276" w:lineRule="auto"/>
+        <w:rPr>
+          <w:rFonts w:ascii="David" w:eastAsia="Aptos" w:hAnsi="David" w:cs="David"/>
+        </w:rPr>
+      </w:pPr>
+      <w:r>
+        <w:rPr>
+          <w:rFonts w:ascii="David" w:eastAsia="Aptos" w:hAnsi="David" w:cs="David"/>
+        </w:rPr>
+        <w:t>SPORTSHOP_DB_USER</w:t>
+      </w:r>
+    </w:p>
+    <w:p>
+      <w:pPr>
+        <w:bidi/>
+        <w:spacing w:line="276" w:lineRule="auto"/>
+        <w:rPr>
+          <w:rFonts w:ascii="David" w:eastAsia="Aptos" w:hAnsi="David" w:cs="David"/>
+        </w:rPr>
+      </w:pPr>
+      <w:r>
+        <w:rPr>
+          <w:rFonts w:ascii="David" w:eastAsia="Aptos" w:hAnsi="David" w:cs="David"/>
+        </w:rPr>
+        <w:t>SPORTSHOP_DB_PASSWORD</w:t>
+      </w:r>
+    </w:p>
+    <w:p>
+      <w:pPr>
+        <w:bidi/>
+        <w:spacing w:line="276" w:lineRule="auto"/>
+        <w:rPr>
+          <w:rFonts w:ascii="David" w:eastAsia="Aptos" w:hAnsi="David" w:cs="David"/>
+        </w:rPr>
+      </w:pPr>
+      <w:r>
+        <w:rPr>
+          <w:rFonts w:ascii="David" w:eastAsia="Aptos" w:hAnsi="David" w:cs="David"/>
+        </w:rPr>
+        <w:t>SPORTSHOP_DB_NAME</w:t>
+      </w:r>
+    </w:p>
+    <w:p>
+      <w:pPr>
+        <w:bidi/>
+        <w:spacing w:line="276" w:lineRule="auto"/>
+        <w:rPr>
+          <w:rFonts w:ascii="David" w:eastAsia="Aptos" w:hAnsi="David" w:cs="David"/>
+          <w:rtl/>
+        </w:rPr>
+      </w:pPr>
+      <w:r>
+        <w:rPr>
+          <w:rFonts w:ascii="David" w:eastAsia="Aptos" w:hAnsi="David" w:cs="David" w:hint="cs"/>
+          <w:rtl/>
+        </w:rPr>
+        <w:t>כך שיתאימו לערכים שקיימים ב</w:t>
+      </w:r>
+      <w:r>
+        <w:rPr>
+          <w:rFonts w:ascii="David" w:eastAsia="Aptos" w:hAnsi="David" w:cs="David"/>
+        </w:rPr>
+        <w:t>deploy</w:t>
+      </w:r>
+      <w:r>
+        <w:rPr>
+          <w:rFonts w:ascii="David" w:eastAsia="Aptos" w:hAnsi="David" w:cs="David" w:hint="cs"/>
+          <w:rtl/>
+        </w:rPr>
+        <w:t xml:space="preserve"> כדי שנוכל להתחבר בהצלחה</w:t>
+      </w:r>
+      <w:r>
+        <w:rPr>
+          <w:rFonts w:ascii="David" w:eastAsia="Aptos" w:hAnsi="David" w:cs="David" w:hint="cs"/>
+          <w:rtl/>
+        </w:rPr>
+        <w:t xml:space="preserve"> אל ה</w:t>
+      </w:r>
+      <w:r>
+        <w:rPr>
+          <w:rFonts w:ascii="David" w:eastAsia="Aptos" w:hAnsi="David" w:cs="David"/>
+        </w:rPr>
+        <w:t>DB</w:t>
+      </w:r>
+      <w:r>
+        <w:rPr>
+          <w:rFonts w:ascii="David" w:eastAsia="Aptos" w:hAnsi="David" w:cs="David" w:hint="cs"/>
+          <w:rtl/>
+        </w:rPr>
+        <w:t>.</w:t>
+      </w:r>
+      <w:r>
+        <w:rPr>
+          <w:rFonts w:ascii="David" w:eastAsia="Aptos" w:hAnsi="David" w:cs="David" w:hint="cs"/>
+          <w:rtl/>
+        </w:rPr>
+        <w:t xml:space="preserve"> שאר הערכים מותאמים כבר ואין צורך לשנותם.</w:t>
+      </w:r>
+    </w:p>
+    <w:p>
+      <w:pPr>
+        <w:bidi/>
+        <w:spacing w:line="276" w:lineRule="auto"/>
+        <w:rPr>
+          <w:rFonts w:ascii="David" w:eastAsia="Aptos" w:hAnsi="David" w:cs="David"/>
+          <w:rtl/>
+        </w:rPr>
+      </w:pPr>
+    </w:p>
+    <w:p>
+      <w:pPr>
+        <w:bidi/>
+        <w:spacing w:line="276" w:lineRule="auto"/>
+        <w:rPr>
+          <w:rFonts w:ascii="David" w:eastAsia="Aptos" w:hAnsi="David" w:cs="David"/>
+          <w:u w:val="single"/>
+          <w:rtl/>
+        </w:rPr>
+      </w:pPr>
+      <w:r>
+        <w:rPr>
+          <w:rFonts w:ascii="David" w:eastAsia="Aptos" w:hAnsi="David" w:cs="David" w:hint="cs"/>
+          <w:u w:val="single"/>
+          <w:rtl/>
+        </w:rPr>
+        <w:t>שלב 3:</w:t>
+      </w:r>
+    </w:p>
+    <w:p>
+      <w:pPr>
+        <w:bidi/>
+        <w:spacing w:line="276" w:lineRule="auto"/>
+        <w:rPr>
+          <w:rFonts w:ascii="David" w:eastAsia="Aptos" w:hAnsi="David" w:cs="David"/>
+          <w:rtl/>
+        </w:rPr>
+      </w:pPr>
+      <w:r>
+        <w:rPr>
+          <w:rFonts w:ascii="David" w:eastAsia="Aptos" w:hAnsi="David" w:cs="David" w:hint="cs"/>
+          <w:rtl/>
+        </w:rPr>
+        <w:t>יש להיכנס לתיקיית ה</w:t>
+      </w:r>
+      <w:r>
+        <w:rPr>
+          <w:rFonts w:ascii="David" w:eastAsia="Aptos" w:hAnsi="David" w:cs="David"/>
+        </w:rPr>
+        <w:t>deploy</w:t>
+      </w:r>
+      <w:r>
+        <w:rPr>
+          <w:rFonts w:ascii="David" w:eastAsia="Aptos" w:hAnsi="David" w:cs="David" w:hint="cs"/>
+          <w:rtl/>
+        </w:rPr>
+        <w:t xml:space="preserve"> ולהריץ את הפקודה: </w:t>
+      </w:r>
+    </w:p>
+    <w:p>
+      <w:pPr>
+        <w:bidi/>
+        <w:spacing w:line="276" w:lineRule="auto"/>
+        <w:jc w:val="right"/>
+        <w:rPr>
+          <w:rFonts w:ascii="David" w:eastAsia="Aptos" w:hAnsi="David" w:cs="David"/>
+        </w:rPr>
+      </w:pPr>
+      <w:r>
+        <w:rPr>
+          <w:rFonts w:ascii="David" w:eastAsia="Aptos" w:hAnsi="David" w:cs="David"/>
+        </w:rPr>
+        <w:t>docker compose up -d</w:t>
+      </w:r>
+    </w:p>
+    <w:p>
+      <w:pPr>
+        <w:bidi/>
+        <w:spacing w:line="276" w:lineRule="auto"/>
+        <w:rPr>
+          <w:rFonts w:ascii="David" w:eastAsia="Aptos" w:hAnsi="David" w:cs="David"/>
+          <w:rtl/>
+        </w:rPr>
+      </w:pPr>
+      <w:r>
+        <w:rPr>
+          <w:rFonts w:ascii="David" w:eastAsia="Aptos" w:hAnsi="David" w:cs="David" w:hint="cs"/>
+          <w:rtl/>
+        </w:rPr>
+        <w:t>צריך לחכות שהכול יעלה בהצלחה (</w:t>
+      </w:r>
+      <w:r>
+        <w:rPr>
+          <w:rFonts w:ascii="David" w:eastAsia="Aptos" w:hAnsi="David" w:cs="David"/>
+        </w:rPr>
+        <w:t>DB</w:t>
+      </w:r>
+      <w:r>
+        <w:rPr>
+          <w:rFonts w:ascii="David" w:eastAsia="Aptos" w:hAnsi="David" w:cs="David" w:hint="cs"/>
+          <w:rtl/>
+        </w:rPr>
+        <w:t xml:space="preserve"> בפעם הראשונה עשוי לקחת קצת זמן) </w:t>
+      </w:r>
+      <w:r>
+        <w:rPr>
+          <w:rFonts w:ascii="David" w:eastAsia="Aptos" w:hAnsi="David" w:cs="David"/>
+          <w:rtl/>
+        </w:rPr>
+        <w:t>–</w:t>
+      </w:r>
+      <w:r>
+        <w:rPr>
+          <w:rFonts w:ascii="David" w:eastAsia="Aptos" w:hAnsi="David" w:cs="David" w:hint="cs"/>
+          <w:rtl/>
+        </w:rPr>
+        <w:t xml:space="preserve"> אם נכשל עשוי להיות בגלל </w:t>
+      </w:r>
+      <w:r>
+        <w:rPr>
+          <w:rFonts w:ascii="David" w:eastAsia="Aptos" w:hAnsi="David" w:cs="David"/>
+        </w:rPr>
+        <w:t>HEALTHCHECKS</w:t>
+      </w:r>
+      <w:r>
+        <w:rPr>
+          <w:rFonts w:ascii="David" w:eastAsia="Aptos" w:hAnsi="David" w:cs="David" w:hint="cs"/>
+          <w:rtl/>
+        </w:rPr>
+        <w:t xml:space="preserve"> ויש להעלות ב</w:t>
+      </w:r>
+      <w:r>
+        <w:rPr>
+          <w:rFonts w:ascii="David" w:eastAsia="Aptos" w:hAnsi="David" w:cs="David"/>
+        </w:rPr>
+        <w:t>DOCKER COMPOSE</w:t>
+      </w:r>
+      <w:r>
+        <w:rPr>
+          <w:rFonts w:ascii="David" w:eastAsia="Aptos" w:hAnsi="David" w:cs="David" w:hint="cs"/>
+          <w:rtl/>
+        </w:rPr>
+        <w:t xml:space="preserve"> את הערכים הקשורים לבדיקות הללו.</w:t>
+      </w:r>
+    </w:p>
+    <w:p>
+      <w:pPr>
+        <w:bidi/>
+        <w:spacing w:line="276" w:lineRule="auto"/>
+        <w:rPr>
+          <w:rFonts w:ascii="David" w:eastAsia="Aptos" w:hAnsi="David" w:cs="David"/>
+          <w:rtl/>
+        </w:rPr>
+      </w:pPr>
+    </w:p>
+    <w:p>
+      <w:pPr>
+        <w:bidi/>
+        <w:spacing w:line="276" w:lineRule="auto"/>
+        <w:rPr>
+          <w:rFonts w:ascii="David" w:eastAsia="Aptos" w:hAnsi="David" w:cs="David"/>
+          <w:u w:val="single"/>
+        </w:rPr>
+      </w:pPr>
+      <w:r>
+        <w:rPr>
+          <w:rFonts w:ascii="David" w:eastAsia="Aptos" w:hAnsi="David" w:cs="David"/>
+          <w:u w:val="single"/>
+          <w:rtl/>
+        </w:rPr>
+        <w:t xml:space="preserve">שלב </w:t>
+      </w:r>
+      <w:r>
+        <w:rPr>
+          <w:rFonts w:ascii="David" w:eastAsia="Aptos" w:hAnsi="David" w:cs="David" w:hint="cs"/>
+          <w:u w:val="single"/>
+          <w:rtl/>
+        </w:rPr>
+        <w:t>4</w:t>
+      </w:r>
+      <w:r>
+        <w:rPr>
+          <w:rFonts w:ascii="David" w:eastAsia="Aptos" w:hAnsi="David" w:cs="David"/>
+          <w:u w:val="single"/>
+          <w:rtl/>
+        </w:rPr>
+        <w:t>:</w:t>
+      </w:r>
+    </w:p>
+    <w:p>
+      <w:pPr>
+        <w:bidi/>
+        <w:spacing w:line="276" w:lineRule="auto"/>
+        <w:rPr>
+          <w:rFonts w:ascii="David" w:eastAsia="Aptos" w:hAnsi="David" w:cs="David"/>
+          <w:rtl/>
+        </w:rPr>
+      </w:pPr>
+      <w:r>
+        <w:rPr>
+          <w:rFonts w:ascii="David" w:eastAsia="Aptos" w:hAnsi="David" w:cs="David" w:hint="cs"/>
+          <w:rtl/>
+        </w:rPr>
+        <w:t>יש לפתוח את הלינק הבא:</w:t>
+      </w:r>
+    </w:p>
+    <w:p>
+      <w:pPr>
+        <w:bidi/>
+        <w:spacing w:line="276" w:lineRule="auto"/>
+        <w:jc w:val="right"/>
+        <w:rPr>
+          <w:rFonts w:ascii="David" w:eastAsia="Aptos" w:hAnsi="David" w:cs="David"/>
+        </w:rPr>
+      </w:pPr>
+      <w:r>
+        <w:rPr>
+          <w:rFonts w:ascii="David" w:eastAsia="Aptos" w:hAnsi="David" w:cs="David"/>
+        </w:rPr>
+        <w:t>https://localhost:46443</w:t>
+      </w:r>
+    </w:p>
+    <w:p>
+      <w:pPr>
+        <w:bidi/>
+        <w:spacing w:line="276" w:lineRule="auto"/>
+        <w:rPr>
+          <w:rFonts w:ascii="David" w:eastAsia="Aptos" w:hAnsi="David" w:cs="David"/>
+          <w:rtl/>
+        </w:rPr>
+      </w:pPr>
+      <w:r>
+        <w:rPr>
+          <w:rFonts w:ascii="David" w:eastAsia="Aptos" w:hAnsi="David" w:cs="David" w:hint="cs"/>
+          <w:rtl/>
+        </w:rPr>
+        <w:t>ולהתחיל לעבוד עם האפליקציה.</w:t>
+      </w:r>
+    </w:p>
+    <w:p>
+      <w:pPr>
+        <w:bidi/>
+        <w:spacing w:line="276" w:lineRule="auto"/>
+        <w:rPr>
+          <w:rFonts w:ascii="David" w:eastAsia="Aptos" w:hAnsi="David" w:cs="David"/>
+          <w:rtl/>
+        </w:rPr>
+      </w:pPr>
+      <w:r>
+        <w:rPr>
+          <w:rFonts w:ascii="David" w:eastAsia="Aptos" w:hAnsi="David" w:cs="David" w:hint="cs"/>
+          <w:rtl/>
+        </w:rPr>
+        <w:t>בקובץ ה</w:t>
+      </w:r>
+      <w:r>
+        <w:rPr>
+          <w:rFonts w:ascii="David" w:eastAsia="Aptos" w:hAnsi="David" w:cs="David"/>
+        </w:rPr>
+        <w:t>DOCKER COMPOSE</w:t>
+      </w:r>
+      <w:r>
+        <w:rPr>
+          <w:rFonts w:ascii="David" w:eastAsia="Aptos" w:hAnsi="David" w:cs="David" w:hint="cs"/>
+          <w:rtl/>
+        </w:rPr>
+        <w:t xml:space="preserve"> יש מדריך בתחילתו כתוב כהערה במידה ורוצים להעלים את ההערה שקשורה ל</w:t>
+      </w:r>
+      <w:r>
+        <w:rPr>
+          <w:rFonts w:ascii="David" w:eastAsia="Aptos" w:hAnsi="David" w:cs="David"/>
+        </w:rPr>
+        <w:t>certs</w:t>
+      </w:r>
+      <w:r>
+        <w:rPr>
+          <w:rFonts w:ascii="David" w:eastAsia="Aptos" w:hAnsi="David" w:cs="David" w:hint="cs"/>
+          <w:rtl/>
+        </w:rPr>
+        <w:t xml:space="preserve"> שעשויה להופיע בדפדפן.</w:t>
+      </w:r>
+    </w:p>
+    <w:p>
+      <w:pPr>
+        <w:bidi/>
+        <w:spacing w:line="276" w:lineRule="auto"/>
+        <w:rPr>
+          <w:rFonts w:ascii="David" w:eastAsia="Aptos" w:hAnsi="David" w:cs="David"/>
+          <w:rtl/>
+        </w:rPr>
+      </w:pPr>
+    </w:p>
+    <w:p>
+      <w:pPr>
+        <w:bidi/>
+        <w:spacing w:line="276" w:lineRule="auto"/>
+        <w:rPr>
+          <w:rFonts w:ascii="David" w:eastAsia="Aptos" w:hAnsi="David" w:cs="David"/>
+          <w:rtl/>
+        </w:rPr>
+      </w:pPr>
+      <w:r>
+        <w:rPr>
+          <w:rFonts w:ascii="David" w:eastAsia="Aptos" w:hAnsi="David" w:cs="David" w:hint="cs"/>
+          <w:rtl/>
+        </w:rPr>
+        <w:t>כדי לסגור את הפרוייקט יש להריץ את הפקודה:</w:t>
+      </w:r>
+    </w:p>
+    <w:p>
+      <w:pPr>
+        <w:bidi/>
+        <w:spacing w:line="276" w:lineRule="auto"/>
+        <w:jc w:val="right"/>
+        <w:rPr>
+          <w:rFonts w:ascii="David" w:eastAsia="Aptos" w:hAnsi="David" w:cs="David"/>
+        </w:rPr>
+      </w:pPr>
+      <w:r>
+        <w:rPr>
+          <w:rFonts w:ascii="David" w:eastAsia="Aptos" w:hAnsi="David" w:cs="David"/>
+        </w:rPr>
+        <w:t xml:space="preserve">docker compose </w:t>
+      </w:r>
+      <w:r>
+        <w:rPr>
+          <w:rFonts w:ascii="David" w:eastAsia="Aptos" w:hAnsi="David" w:cs="David"/>
+        </w:rPr>
+        <w:t>down</w:t>
+      </w:r>
+    </w:p>
+    <w:p>
+      <w:pPr>
+        <w:bidi/>
+        <w:spacing w:line="276" w:lineRule="auto"/>
+        <w:jc w:val="right"/>
+        <w:rPr>
+          <w:rFonts w:ascii="David" w:eastAsia="Aptos" w:hAnsi="David" w:cs="David"/>
+        </w:rPr>
+      </w:pPr>
+    </w:p>
+    <w:p>
+      <w:pPr>
+        <w:bidi/>
+        <w:spacing w:line="276" w:lineRule="auto"/>
+        <w:jc w:val="right"/>
+        <w:rPr>
+          <w:rFonts w:ascii="David" w:eastAsia="Aptos" w:hAnsi="David" w:cs="David"/>
+        </w:rPr>
+      </w:pPr>
+    </w:p>
+    <w:p>
+      <w:pPr>
+        <w:bidi/>
+        <w:spacing w:line="276" w:lineRule="auto"/>
+        <w:jc w:val="right"/>
+        <w:rPr>
+          <w:rFonts w:ascii="David" w:eastAsia="Aptos" w:hAnsi="David" w:cs="David"/>
+        </w:rPr>
+      </w:pPr>
+    </w:p>
+    <w:p>
+      <w:pPr>
+        <w:bidi/>
+        <w:spacing w:line="276" w:lineRule="auto"/>
+        <w:jc w:val="right"/>
+        <w:rPr>
+          <w:rFonts w:ascii="David" w:eastAsia="Aptos" w:hAnsi="David" w:cs="David"/>
+        </w:rPr>
+      </w:pPr>
+    </w:p>
+    <w:p>
+      <w:pPr>
+        <w:bidi/>
+        <w:spacing w:line="276" w:lineRule="auto"/>
+        <w:jc w:val="right"/>
+        <w:rPr>
+          <w:rFonts w:ascii="David" w:eastAsia="Aptos" w:hAnsi="David" w:cs="David"/>
+        </w:rPr>
+      </w:pPr>
+    </w:p>
+    <w:p>
+      <w:pPr>
+        <w:bidi/>
+        <w:spacing w:line="276" w:lineRule="auto"/>
+        <w:jc w:val="right"/>
+        <w:rPr>
+          <w:rFonts w:ascii="David" w:eastAsia="Aptos" w:hAnsi="David" w:cs="David"/>
+        </w:rPr>
+      </w:pPr>
+    </w:p>
+    <w:p>
+      <w:pPr>
+        <w:bidi/>
+        <w:spacing w:line="276" w:lineRule="auto"/>
+        <w:jc w:val="right"/>
+        <w:rPr>
+          <w:rFonts w:ascii="David" w:eastAsia="Aptos" w:hAnsi="David" w:cs="David"/>
+        </w:rPr>
+      </w:pPr>
+    </w:p>
+    <w:p>
+      <w:pPr>
+        <w:bidi/>
+        <w:spacing w:line="276" w:lineRule="auto"/>
+        <w:jc w:val="right"/>
+        <w:rPr>
+          <w:rFonts w:ascii="David" w:eastAsia="Aptos" w:hAnsi="David" w:cs="David"/>
+        </w:rPr>
+      </w:pPr>
+    </w:p>
+    <w:p>
+      <w:pPr>
+        <w:bidi/>
+        <w:spacing w:line="276" w:lineRule="auto"/>
+        <w:rPr>
+          <w:rFonts w:ascii="David" w:eastAsia="Aptos" w:hAnsi="David" w:cs="David"/>
           <w:b/>
           <w:bCs/>
           <w:sz w:val="32"/>
           <w:szCs w:val="32"/>
           <w:u w:val="single"/>
         </w:rPr>
-        <w:t>PROD</w:t>
-      </w:r>
-      <w:r>
-        <w:rPr>
-          <w:rFonts w:ascii="David" w:hAnsi="David" w:cs="David" w:hint="cs"/>
+      </w:pPr>
+      <w:r>
+        <w:rPr>
+          <w:rFonts w:ascii="David" w:eastAsia="Aptos" w:hAnsi="David" w:cs="David"/>
           <w:b/>
           <w:bCs/>
           <w:sz w:val="32"/>
@@ -429,1581 +2088,6 @@
           <w:u w:val="single"/>
           <w:rtl/>
         </w:rPr>
-        <w:t xml:space="preserve"> - מומלץ</w:t>
-      </w:r>
-    </w:p>
-    <w:p>
-      <w:pPr>
-        <w:bidi/>
-        <w:spacing w:line="276" w:lineRule="auto"/>
-        <w:rPr>
-          <w:rFonts w:ascii="David" w:hAnsi="David" w:cs="David"/>
-          <w:u w:val="single"/>
-          <w:rtl/>
-        </w:rPr>
-      </w:pPr>
-      <w:r>
-        <w:rPr>
-          <w:rFonts w:ascii="David" w:hAnsi="David" w:cs="David" w:hint="cs"/>
-          <w:u w:val="single"/>
-          <w:rtl/>
-        </w:rPr>
-        <w:t>דרישות מקדימות:</w:t>
-      </w:r>
-    </w:p>
-    <w:p>
-      <w:pPr>
-        <w:pStyle w:val="ListParagraph"/>
-        <w:numPr>
-          <w:ilvl w:val="0"/>
-          <w:numId w:val="20"/>
-        </w:numPr>
-        <w:bidi/>
-        <w:spacing w:line="276" w:lineRule="auto"/>
-        <w:rPr>
-          <w:rFonts w:ascii="David" w:hAnsi="David" w:cs="David"/>
-        </w:rPr>
-      </w:pPr>
-      <w:r>
-        <w:rPr>
-          <w:rFonts w:ascii="David" w:hAnsi="David" w:cs="David"/>
-        </w:rPr>
-        <w:t>GIT</w:t>
-      </w:r>
-    </w:p>
-    <w:p>
-      <w:pPr>
-        <w:pStyle w:val="ListParagraph"/>
-        <w:numPr>
-          <w:ilvl w:val="0"/>
-          <w:numId w:val="20"/>
-        </w:numPr>
-        <w:bidi/>
-        <w:spacing w:line="276" w:lineRule="auto"/>
-        <w:rPr>
-          <w:rFonts w:ascii="David" w:hAnsi="David" w:cs="David"/>
-        </w:rPr>
-      </w:pPr>
-      <w:r>
-        <w:rPr>
-          <w:rFonts w:ascii="David" w:hAnsi="David" w:cs="David"/>
-        </w:rPr>
-        <w:t>DOCKER</w:t>
-      </w:r>
-      <w:r>
-        <w:rPr>
-          <w:rFonts w:ascii="David" w:hAnsi="David" w:cs="David" w:hint="cs"/>
-          <w:rtl/>
-        </w:rPr>
-        <w:t xml:space="preserve"> </w:t>
-      </w:r>
-      <w:r>
-        <w:rPr>
-          <w:rFonts w:ascii="David" w:hAnsi="David" w:cs="David"/>
-          <w:rtl/>
-        </w:rPr>
-        <w:t>–</w:t>
-      </w:r>
-      <w:r>
-        <w:rPr>
-          <w:rFonts w:ascii="David" w:hAnsi="David" w:cs="David" w:hint="cs"/>
-          <w:rtl/>
-        </w:rPr>
-        <w:t xml:space="preserve"> כולל </w:t>
-      </w:r>
-      <w:r>
-        <w:rPr>
-          <w:rFonts w:ascii="David" w:hAnsi="David" w:cs="David"/>
-        </w:rPr>
-        <w:t>COMPOSE</w:t>
-      </w:r>
-      <w:r>
-        <w:rPr>
-          <w:rFonts w:ascii="David" w:hAnsi="David" w:cs="David" w:hint="cs"/>
-          <w:rtl/>
-        </w:rPr>
-        <w:t xml:space="preserve"> גרסא 2 ומעלה (וגישה לאינטרנט לצורך הורדת ה</w:t>
-      </w:r>
-      <w:r>
-        <w:rPr>
-          <w:rFonts w:ascii="David" w:hAnsi="David" w:cs="David"/>
-        </w:rPr>
-        <w:t>IMAGES</w:t>
-      </w:r>
-      <w:r>
-        <w:rPr>
-          <w:rFonts w:ascii="David" w:hAnsi="David" w:cs="David" w:hint="cs"/>
-          <w:rtl/>
-        </w:rPr>
-        <w:t>).</w:t>
-      </w:r>
-    </w:p>
-    <w:p>
-      <w:pPr>
-        <w:bidi/>
-        <w:spacing w:line="276" w:lineRule="auto"/>
-        <w:rPr>
-          <w:rFonts w:ascii="David" w:hAnsi="David" w:cs="David"/>
-          <w:u w:val="single"/>
-        </w:rPr>
-      </w:pPr>
-      <w:r>
-        <w:rPr>
-          <w:rFonts w:ascii="David" w:hAnsi="David" w:cs="David" w:hint="cs"/>
-          <w:u w:val="single"/>
-          <w:rtl/>
-        </w:rPr>
-        <w:t>הקדמה</w:t>
-      </w:r>
-      <w:r>
-        <w:rPr>
-          <w:rFonts w:ascii="David" w:hAnsi="David" w:cs="David"/>
-          <w:u w:val="single"/>
-          <w:rtl/>
-        </w:rPr>
-        <w:t>:</w:t>
-      </w:r>
-    </w:p>
-    <w:p>
-      <w:pPr>
-        <w:bidi/>
-        <w:spacing w:line="276" w:lineRule="auto"/>
-        <w:rPr>
-          <w:rFonts w:ascii="David" w:eastAsia="Aptos" w:hAnsi="David" w:cs="David"/>
-          <w:rtl/>
-        </w:rPr>
-      </w:pPr>
-      <w:r>
-        <w:rPr>
-          <w:rFonts w:ascii="David" w:eastAsia="Aptos" w:hAnsi="David" w:cs="David" w:hint="cs"/>
-          <w:rtl/>
-        </w:rPr>
-        <w:t>בדרך זו, קיימים ל</w:t>
-      </w:r>
-      <w:r>
-        <w:rPr>
-          <w:rFonts w:ascii="David" w:eastAsia="Aptos" w:hAnsi="David" w:cs="David"/>
-        </w:rPr>
-        <w:t>REPOSITORIES</w:t>
-      </w:r>
-      <w:r>
-        <w:rPr>
-          <w:rFonts w:ascii="David" w:eastAsia="Aptos" w:hAnsi="David" w:cs="David" w:hint="cs"/>
-          <w:rtl/>
-        </w:rPr>
-        <w:t xml:space="preserve"> תהליכי </w:t>
-      </w:r>
-      <w:r>
-        <w:rPr>
-          <w:rFonts w:ascii="David" w:eastAsia="Aptos" w:hAnsi="David" w:cs="David"/>
-        </w:rPr>
-        <w:t>CI</w:t>
-      </w:r>
-      <w:r>
-        <w:rPr>
-          <w:rFonts w:ascii="David" w:eastAsia="Aptos" w:hAnsi="David" w:cs="David" w:hint="cs"/>
-          <w:rtl/>
-        </w:rPr>
-        <w:t xml:space="preserve"> שבונים את ה</w:t>
-      </w:r>
-      <w:r>
-        <w:rPr>
-          <w:rFonts w:ascii="David" w:eastAsia="Aptos" w:hAnsi="David" w:cs="David"/>
-        </w:rPr>
-        <w:t>DOCKER IMAGES</w:t>
-      </w:r>
-      <w:r>
-        <w:rPr>
-          <w:rFonts w:ascii="David" w:eastAsia="Aptos" w:hAnsi="David" w:cs="David" w:hint="cs"/>
-          <w:rtl/>
-        </w:rPr>
-        <w:t xml:space="preserve"> בכל דחיפה של קוד לענף </w:t>
-      </w:r>
-      <w:r>
-        <w:rPr>
-          <w:rFonts w:ascii="David" w:eastAsia="Aptos" w:hAnsi="David" w:cs="David"/>
-        </w:rPr>
-        <w:t>main</w:t>
-      </w:r>
-      <w:r>
-        <w:rPr>
-          <w:rFonts w:ascii="David" w:eastAsia="Aptos" w:hAnsi="David" w:cs="David" w:hint="cs"/>
-          <w:rtl/>
-        </w:rPr>
-        <w:t xml:space="preserve"> </w:t>
-      </w:r>
-      <w:r>
-        <w:rPr>
-          <w:rFonts w:ascii="David" w:eastAsia="Aptos" w:hAnsi="David" w:cs="David"/>
-          <w:rtl/>
-        </w:rPr>
-        <w:t>–</w:t>
-      </w:r>
-      <w:r>
-        <w:rPr>
-          <w:rFonts w:ascii="David" w:eastAsia="Aptos" w:hAnsi="David" w:cs="David" w:hint="cs"/>
-          <w:rtl/>
-        </w:rPr>
-        <w:t xml:space="preserve"> אנו נוריד ונפעיל אותם באמצעות </w:t>
-      </w:r>
-      <w:r>
-        <w:rPr>
-          <w:rFonts w:ascii="David" w:eastAsia="Aptos" w:hAnsi="David" w:cs="David"/>
-        </w:rPr>
-        <w:t>DOCKER COMPOSE</w:t>
-      </w:r>
-      <w:r>
-        <w:rPr>
-          <w:rFonts w:ascii="David" w:eastAsia="Aptos" w:hAnsi="David" w:cs="David" w:hint="cs"/>
-          <w:rtl/>
-        </w:rPr>
-        <w:t>.</w:t>
-      </w:r>
-    </w:p>
-    <w:p>
-      <w:pPr>
-        <w:bidi/>
-        <w:spacing w:line="276" w:lineRule="auto"/>
-        <w:rPr>
-          <w:rFonts w:ascii="David" w:eastAsia="Aptos" w:hAnsi="David" w:cs="David"/>
-        </w:rPr>
-      </w:pPr>
-      <w:r>
-        <w:rPr>
-          <w:rFonts w:ascii="David" w:eastAsia="Aptos" w:hAnsi="David" w:cs="David" w:hint="cs"/>
-          <w:rtl/>
-        </w:rPr>
-        <w:t>כמו-כן, בקבוץ ה</w:t>
-      </w:r>
-      <w:r>
-        <w:rPr>
-          <w:rFonts w:ascii="David" w:eastAsia="Aptos" w:hAnsi="David" w:cs="David"/>
-        </w:rPr>
-        <w:t>DOCKER COMPOSE</w:t>
-      </w:r>
-      <w:r>
-        <w:rPr>
-          <w:rFonts w:ascii="David" w:eastAsia="Aptos" w:hAnsi="David" w:cs="David" w:hint="cs"/>
-          <w:rtl/>
-        </w:rPr>
-        <w:t xml:space="preserve"> קיימים </w:t>
-      </w:r>
-      <w:r>
-        <w:rPr>
-          <w:rFonts w:ascii="David" w:eastAsia="Aptos" w:hAnsi="David" w:cs="David"/>
-        </w:rPr>
-        <w:t>VOLUMES</w:t>
-      </w:r>
-      <w:r>
-        <w:rPr>
-          <w:rFonts w:ascii="David" w:eastAsia="Aptos" w:hAnsi="David" w:cs="David" w:hint="cs"/>
-          <w:rtl/>
-        </w:rPr>
-        <w:t xml:space="preserve"> לצורך שמירה על מידע בין הרצות</w:t>
-      </w:r>
-      <w:r>
-        <w:rPr>
-          <w:rFonts w:ascii="David" w:eastAsia="Aptos" w:hAnsi="David" w:cs="David" w:hint="cs"/>
-          <w:rtl/>
-        </w:rPr>
-        <w:t xml:space="preserve"> </w:t>
-      </w:r>
-      <w:r>
-        <w:rPr>
-          <w:rFonts w:ascii="David" w:eastAsia="Aptos" w:hAnsi="David" w:cs="David"/>
-          <w:rtl/>
-        </w:rPr>
-        <w:t>–</w:t>
-      </w:r>
-      <w:r>
-        <w:rPr>
-          <w:rFonts w:ascii="David" w:eastAsia="Aptos" w:hAnsi="David" w:cs="David" w:hint="cs"/>
-          <w:rtl/>
-        </w:rPr>
-        <w:t xml:space="preserve"> יש לשים לב שמריצים (אם רוצים לשמור על אותו מידע) עם אותם ההפניות.</w:t>
-      </w:r>
-    </w:p>
-    <w:p>
-      <w:pPr>
-        <w:bidi/>
-        <w:spacing w:line="276" w:lineRule="auto"/>
-        <w:rPr>
-          <w:rFonts w:ascii="David" w:hAnsi="David" w:cs="David"/>
-          <w:u w:val="single"/>
-          <w:rtl/>
-        </w:rPr>
-      </w:pPr>
-      <w:r>
-        <w:rPr>
-          <w:rFonts w:ascii="David" w:hAnsi="David" w:cs="David" w:hint="cs"/>
-          <w:u w:val="single"/>
-          <w:rtl/>
-        </w:rPr>
-        <w:t>שלב 1:</w:t>
-      </w:r>
-    </w:p>
-    <w:p>
-      <w:pPr>
-        <w:bidi/>
-        <w:spacing w:line="276" w:lineRule="auto"/>
-        <w:rPr>
-          <w:rFonts w:ascii="David" w:hAnsi="David" w:cs="David"/>
-          <w:rtl/>
-        </w:rPr>
-      </w:pPr>
-      <w:r>
-        <w:rPr>
-          <w:rFonts w:ascii="David" w:hAnsi="David" w:cs="David" w:hint="cs"/>
-          <w:rtl/>
-        </w:rPr>
-        <w:t xml:space="preserve">יש להוריד או לעשות </w:t>
-      </w:r>
-      <w:r>
-        <w:rPr>
-          <w:rFonts w:ascii="David" w:hAnsi="David" w:cs="David"/>
-        </w:rPr>
-        <w:t>CLONE</w:t>
-      </w:r>
-      <w:r>
-        <w:rPr>
-          <w:rFonts w:ascii="David" w:hAnsi="David" w:cs="David" w:hint="cs"/>
-          <w:rtl/>
-        </w:rPr>
-        <w:t xml:space="preserve"> לפרוייקטים הבאים:</w:t>
-      </w:r>
-    </w:p>
-    <w:p>
-      <w:pPr>
-        <w:spacing w:before="100" w:beforeAutospacing="1" w:after="100" w:afterAutospacing="1" w:line="240" w:lineRule="auto"/>
-        <w:rPr>
-          <w:rFonts w:ascii="Times New Roman" w:eastAsia="Times New Roman" w:hAnsi="Times New Roman" w:cs="Times New Roman"/>
-          <w:kern w:val="0"/>
-          <w14:ligatures w14:val="none"/>
-        </w:rPr>
-      </w:pPr>
-      <w:r>
-        <w:rPr>
-          <w:rFonts w:ascii="Courier New" w:eastAsia="Times New Roman" w:hAnsi="Courier New" w:cs="Courier New"/>
-          <w:kern w:val="0"/>
-          <w:sz w:val="20"/>
-          <w:szCs w:val="20"/>
-          <w14:ligatures w14:val="none"/>
-        </w:rPr>
-        <w:t>https://github.com/liranbat/sportshop-backend.git</w:t>
-      </w:r>
-    </w:p>
-    <w:p>
-      <w:pPr>
-        <w:spacing w:before="100" w:beforeAutospacing="1" w:after="100" w:afterAutospacing="1" w:line="240" w:lineRule="auto"/>
-        <w:rPr>
-          <w:rFonts w:ascii="Times New Roman" w:eastAsia="Times New Roman" w:hAnsi="Times New Roman" w:cs="Times New Roman"/>
-          <w:kern w:val="0"/>
-          <w14:ligatures w14:val="none"/>
-        </w:rPr>
-      </w:pPr>
-      <w:r>
-        <w:rPr>
-          <w:rFonts w:ascii="Courier New" w:eastAsia="Times New Roman" w:hAnsi="Courier New" w:cs="Courier New"/>
-          <w:kern w:val="0"/>
-          <w:sz w:val="20"/>
-          <w:szCs w:val="20"/>
-          <w14:ligatures w14:val="none"/>
-        </w:rPr>
-        <w:t>https://github.com/liranbat/sportshop-frontend.git</w:t>
-      </w:r>
-    </w:p>
-    <w:p>
-      <w:pPr>
-        <w:spacing w:before="100" w:beforeAutospacing="1" w:after="100" w:afterAutospacing="1" w:line="240" w:lineRule="auto"/>
-        <w:rPr>
-          <w:rFonts w:ascii="Times New Roman" w:eastAsia="Times New Roman" w:hAnsi="Times New Roman" w:cs="Times New Roman"/>
-          <w:kern w:val="0"/>
-          <w:rtl/>
-          <w14:ligatures w14:val="none"/>
-        </w:rPr>
-      </w:pPr>
-      <w:r>
-        <w:rPr>
-          <w:rFonts w:ascii="Courier New" w:eastAsia="Times New Roman" w:hAnsi="Courier New" w:cs="Courier New"/>
-          <w:kern w:val="0"/>
-          <w:sz w:val="20"/>
-          <w:szCs w:val="20"/>
-          <w14:ligatures w14:val="none"/>
-        </w:rPr>
-        <w:t>https://github.com/liranbat/sportshop-deploy.git</w:t>
-      </w:r>
-    </w:p>
-    <w:p>
-      <w:pPr>
-        <w:bidi/>
-        <w:spacing w:line="276" w:lineRule="auto"/>
-        <w:rPr>
-          <w:rFonts w:ascii="David" w:hAnsi="David" w:cs="David"/>
-          <w:rtl/>
-        </w:rPr>
-      </w:pPr>
-      <w:r>
-        <w:rPr>
-          <w:rFonts w:ascii="David" w:hAnsi="David" w:cs="David" w:hint="cs"/>
-          <w:rtl/>
-        </w:rPr>
-        <w:t>ליצור תיקיה אחת מעליהם שיראה כך:</w:t>
-      </w:r>
-    </w:p>
-    <w:p>
-      <w:pPr>
-        <w:bidi/>
-        <w:spacing w:line="276" w:lineRule="auto"/>
-        <w:jc w:val="right"/>
-        <w:rPr>
-          <w:rFonts w:ascii="David" w:hAnsi="David" w:cs="David"/>
-        </w:rPr>
-      </w:pPr>
-      <w:proofErr w:type="spellStart"/>
-      <w:r>
-        <w:rPr>
-          <w:rFonts w:ascii="David" w:hAnsi="David" w:cs="David"/>
-        </w:rPr>
-        <w:t>Parent_folder</w:t>
-      </w:r>
-      <w:proofErr w:type="spellEnd"/>
-      <w:r>
-        <w:rPr>
-          <w:rFonts w:ascii="David" w:hAnsi="David" w:cs="David"/>
-        </w:rPr>
-        <w:t xml:space="preserve"> /</w:t>
-      </w:r>
-    </w:p>
-    <w:p>
-      <w:pPr>
-        <w:bidi/>
-        <w:spacing w:line="276" w:lineRule="auto"/>
-        <w:jc w:val="right"/>
-        <w:rPr>
-          <w:rFonts w:ascii="David" w:hAnsi="David" w:cs="David"/>
-        </w:rPr>
-      </w:pPr>
-      <w:r>
-        <w:rPr>
-          <w:rFonts w:ascii="David" w:hAnsi="David" w:cs="David"/>
-        </w:rPr>
-        <w:t xml:space="preserve">|---- </w:t>
-      </w:r>
-      <w:proofErr w:type="spellStart"/>
-      <w:r>
-        <w:rPr>
-          <w:rFonts w:ascii="David" w:hAnsi="David" w:cs="David"/>
-        </w:rPr>
-        <w:t>sportshop</w:t>
-      </w:r>
-      <w:proofErr w:type="spellEnd"/>
-      <w:r>
-        <w:rPr>
-          <w:rFonts w:ascii="David" w:hAnsi="David" w:cs="David"/>
-        </w:rPr>
-        <w:t>-backend/</w:t>
-      </w:r>
-    </w:p>
-    <w:p>
-      <w:pPr>
-        <w:bidi/>
-        <w:spacing w:line="276" w:lineRule="auto"/>
-        <w:jc w:val="right"/>
-        <w:rPr>
-          <w:rFonts w:ascii="David" w:hAnsi="David" w:cs="David"/>
-        </w:rPr>
-      </w:pPr>
-      <w:r>
-        <w:rPr>
-          <w:rFonts w:ascii="David" w:hAnsi="David" w:cs="David"/>
-        </w:rPr>
-        <w:t xml:space="preserve">|---- </w:t>
-      </w:r>
-      <w:proofErr w:type="spellStart"/>
-      <w:r>
-        <w:rPr>
-          <w:rFonts w:ascii="David" w:hAnsi="David" w:cs="David"/>
-        </w:rPr>
-        <w:t>sportshop</w:t>
-      </w:r>
-      <w:proofErr w:type="spellEnd"/>
-      <w:r>
-        <w:rPr>
-          <w:rFonts w:ascii="David" w:hAnsi="David" w:cs="David"/>
-        </w:rPr>
-        <w:t>-</w:t>
-      </w:r>
-      <w:r>
-        <w:rPr>
-          <w:rFonts w:ascii="David" w:hAnsi="David" w:cs="David"/>
-        </w:rPr>
-        <w:t>frontend</w:t>
-      </w:r>
-      <w:r>
-        <w:rPr>
-          <w:rFonts w:ascii="David" w:hAnsi="David" w:cs="David"/>
-        </w:rPr>
-        <w:t>/</w:t>
-      </w:r>
-    </w:p>
-    <w:p>
-      <w:pPr>
-        <w:bidi/>
-        <w:spacing w:line="276" w:lineRule="auto"/>
-        <w:jc w:val="right"/>
-        <w:rPr>
-          <w:rFonts w:ascii="David" w:hAnsi="David" w:cs="David"/>
-        </w:rPr>
-      </w:pPr>
-      <w:r>
-        <w:rPr>
-          <w:rFonts w:ascii="David" w:hAnsi="David" w:cs="David"/>
-        </w:rPr>
-        <w:t xml:space="preserve">|---- </w:t>
-      </w:r>
-      <w:proofErr w:type="spellStart"/>
-      <w:r>
-        <w:rPr>
-          <w:rFonts w:ascii="David" w:hAnsi="David" w:cs="David"/>
-        </w:rPr>
-        <w:t>sportshop</w:t>
-      </w:r>
-      <w:proofErr w:type="spellEnd"/>
-      <w:r>
-        <w:rPr>
-          <w:rFonts w:ascii="David" w:hAnsi="David" w:cs="David"/>
-        </w:rPr>
-        <w:t>-</w:t>
-      </w:r>
-      <w:r>
-        <w:rPr>
-          <w:rFonts w:ascii="David" w:hAnsi="David" w:cs="David"/>
-        </w:rPr>
-        <w:t>deploy</w:t>
-      </w:r>
-      <w:r>
-        <w:rPr>
-          <w:rFonts w:ascii="David" w:hAnsi="David" w:cs="David"/>
-        </w:rPr>
-        <w:t>/</w:t>
-      </w:r>
-    </w:p>
-    <w:p>
-      <w:pPr>
-        <w:bidi/>
-        <w:spacing w:line="276" w:lineRule="auto"/>
-        <w:rPr>
-          <w:rFonts w:ascii="David" w:hAnsi="David" w:cs="David"/>
-          <w:u w:val="single"/>
-        </w:rPr>
-      </w:pPr>
-      <w:r>
-        <w:rPr>
-          <w:rFonts w:ascii="David" w:hAnsi="David" w:cs="David"/>
-          <w:u w:val="single"/>
-          <w:rtl/>
-        </w:rPr>
-        <w:t xml:space="preserve">שלב </w:t>
-      </w:r>
-      <w:r>
-        <w:rPr>
-          <w:rFonts w:ascii="David" w:hAnsi="David" w:cs="David" w:hint="cs"/>
-          <w:u w:val="single"/>
-          <w:rtl/>
-        </w:rPr>
-        <w:t>2:</w:t>
-      </w:r>
-    </w:p>
-    <w:p>
-      <w:pPr>
-        <w:bidi/>
-        <w:spacing w:line="276" w:lineRule="auto"/>
-        <w:rPr>
-          <w:rFonts w:ascii="David" w:eastAsia="Aptos" w:hAnsi="David" w:cs="David"/>
-          <w:rtl/>
-        </w:rPr>
-      </w:pPr>
-      <w:r>
-        <w:rPr>
-          <w:rFonts w:ascii="David" w:eastAsia="Aptos" w:hAnsi="David" w:cs="David" w:hint="cs"/>
-          <w:rtl/>
-        </w:rPr>
-        <w:t>בתוך כל אחד מ-3 ה</w:t>
-      </w:r>
-      <w:r>
-        <w:rPr>
-          <w:rFonts w:ascii="David" w:eastAsia="Aptos" w:hAnsi="David" w:cs="David"/>
-        </w:rPr>
-        <w:t>REPO</w:t>
-      </w:r>
-      <w:r>
-        <w:rPr>
-          <w:rFonts w:ascii="David" w:eastAsia="Aptos" w:hAnsi="David" w:cs="David" w:hint="cs"/>
-          <w:rtl/>
-        </w:rPr>
-        <w:t xml:space="preserve"> קיימם קובץ </w:t>
-      </w:r>
-      <w:r>
-        <w:rPr>
-          <w:rFonts w:ascii="David" w:eastAsia="Aptos" w:hAnsi="David" w:cs="David"/>
-        </w:rPr>
-        <w:t>.</w:t>
-      </w:r>
-      <w:proofErr w:type="spellStart"/>
-      <w:r>
-        <w:rPr>
-          <w:rFonts w:ascii="David" w:eastAsia="Aptos" w:hAnsi="David" w:cs="David"/>
-        </w:rPr>
-        <w:t>env.prod.example</w:t>
-      </w:r>
-      <w:proofErr w:type="spellEnd"/>
-      <w:r>
-        <w:rPr>
-          <w:rFonts w:ascii="David" w:eastAsia="Aptos" w:hAnsi="David" w:cs="David" w:hint="cs"/>
-          <w:rtl/>
-        </w:rPr>
-        <w:t xml:space="preserve"> </w:t>
-      </w:r>
-      <w:r>
-        <w:rPr>
-          <w:rFonts w:ascii="David" w:eastAsia="Aptos" w:hAnsi="David" w:cs="David"/>
-          <w:rtl/>
-        </w:rPr>
-        <w:t>–</w:t>
-      </w:r>
-      <w:r>
-        <w:rPr>
-          <w:rFonts w:ascii="David" w:eastAsia="Aptos" w:hAnsi="David" w:cs="David" w:hint="cs"/>
-          <w:rtl/>
-        </w:rPr>
-        <w:t xml:space="preserve"> יש להעתיק ולהדביק תחת אותו ה</w:t>
-      </w:r>
-      <w:r>
-        <w:rPr>
-          <w:rFonts w:ascii="David" w:eastAsia="Aptos" w:hAnsi="David" w:cs="David"/>
-        </w:rPr>
-        <w:t>REPO</w:t>
-      </w:r>
-      <w:r>
-        <w:rPr>
-          <w:rFonts w:ascii="David" w:eastAsia="Aptos" w:hAnsi="David" w:cs="David" w:hint="cs"/>
-          <w:rtl/>
-        </w:rPr>
-        <w:t xml:space="preserve"> ולשנות את השם ל-</w:t>
-      </w:r>
-      <w:r>
-        <w:rPr>
-          <w:rFonts w:ascii="David" w:eastAsia="Aptos" w:hAnsi="David" w:cs="David"/>
-        </w:rPr>
-        <w:t xml:space="preserve"> .</w:t>
-      </w:r>
-      <w:proofErr w:type="spellStart"/>
-      <w:r>
-        <w:rPr>
-          <w:rFonts w:ascii="David" w:eastAsia="Aptos" w:hAnsi="David" w:cs="David"/>
-        </w:rPr>
-        <w:t>env.prod</w:t>
-      </w:r>
-      <w:proofErr w:type="spellEnd"/>
-      <w:r>
-        <w:rPr>
-          <w:rFonts w:ascii="David" w:eastAsia="Aptos" w:hAnsi="David" w:cs="David" w:hint="cs"/>
-          <w:rtl/>
-        </w:rPr>
-        <w:t xml:space="preserve"> (בתוך </w:t>
-      </w:r>
-      <w:r>
-        <w:rPr>
-          <w:rFonts w:ascii="David" w:eastAsia="Aptos" w:hAnsi="David" w:cs="David"/>
-        </w:rPr>
-        <w:t>REPO</w:t>
-      </w:r>
-      <w:r>
-        <w:rPr>
-          <w:rFonts w:ascii="David" w:eastAsia="Aptos" w:hAnsi="David" w:cs="David" w:hint="cs"/>
-          <w:rtl/>
-        </w:rPr>
-        <w:t xml:space="preserve"> של </w:t>
-      </w:r>
-      <w:r>
-        <w:rPr>
-          <w:rFonts w:ascii="David" w:eastAsia="Aptos" w:hAnsi="David" w:cs="David"/>
-        </w:rPr>
-        <w:t>deploy</w:t>
-      </w:r>
-      <w:r>
-        <w:rPr>
-          <w:rFonts w:ascii="David" w:eastAsia="Aptos" w:hAnsi="David" w:cs="David" w:hint="cs"/>
-          <w:rtl/>
-        </w:rPr>
-        <w:t xml:space="preserve"> השמות צריכים להיות </w:t>
-      </w:r>
-      <w:r>
-        <w:rPr>
-          <w:rFonts w:ascii="David" w:eastAsia="Aptos" w:hAnsi="David" w:cs="David"/>
-        </w:rPr>
-        <w:t>.</w:t>
-      </w:r>
-      <w:proofErr w:type="spellStart"/>
-      <w:r>
-        <w:rPr>
-          <w:rFonts w:ascii="David" w:eastAsia="Aptos" w:hAnsi="David" w:cs="David"/>
-        </w:rPr>
-        <w:t>env.pro</w:t>
-      </w:r>
-      <w:r>
-        <w:rPr>
-          <w:rFonts w:ascii="David" w:eastAsia="Aptos" w:hAnsi="David" w:cs="David"/>
-        </w:rPr>
-        <w:t>d.db.example</w:t>
-      </w:r>
-      <w:proofErr w:type="spellEnd"/>
-      <w:r>
-        <w:rPr>
-          <w:rFonts w:ascii="David" w:eastAsia="Aptos" w:hAnsi="David" w:cs="David" w:hint="cs"/>
-          <w:rtl/>
-        </w:rPr>
-        <w:t xml:space="preserve"> ו- </w:t>
-      </w:r>
-      <w:r>
-        <w:rPr>
-          <w:rFonts w:ascii="David" w:eastAsia="Aptos" w:hAnsi="David" w:cs="David"/>
-        </w:rPr>
-        <w:t>.</w:t>
-      </w:r>
-      <w:proofErr w:type="spellStart"/>
-      <w:r>
-        <w:rPr>
-          <w:rFonts w:ascii="David" w:eastAsia="Aptos" w:hAnsi="David" w:cs="David"/>
-        </w:rPr>
-        <w:t>env.prod.db</w:t>
-      </w:r>
-      <w:proofErr w:type="spellEnd"/>
-      <w:r>
-        <w:rPr>
-          <w:rFonts w:ascii="David" w:eastAsia="Aptos" w:hAnsi="David" w:cs="David" w:hint="cs"/>
-          <w:rtl/>
-        </w:rPr>
-        <w:t>).</w:t>
-      </w:r>
-    </w:p>
-    <w:p>
-      <w:pPr>
-        <w:bidi/>
-        <w:spacing w:line="276" w:lineRule="auto"/>
-        <w:rPr>
-          <w:rFonts w:ascii="David" w:eastAsia="Aptos" w:hAnsi="David" w:cs="David"/>
-          <w:rtl/>
-        </w:rPr>
-      </w:pPr>
-      <w:r>
-        <w:rPr>
-          <w:rFonts w:ascii="David" w:eastAsia="Aptos" w:hAnsi="David" w:cs="David" w:hint="cs"/>
-          <w:rtl/>
-        </w:rPr>
-        <w:t xml:space="preserve">עבור </w:t>
-      </w:r>
-      <w:r>
-        <w:rPr>
-          <w:rFonts w:ascii="David" w:eastAsia="Aptos" w:hAnsi="David" w:cs="David"/>
-          <w:u w:val="single"/>
-        </w:rPr>
-        <w:t>deploy</w:t>
-      </w:r>
-      <w:r>
-        <w:rPr>
-          <w:rFonts w:ascii="David" w:eastAsia="Aptos" w:hAnsi="David" w:cs="David" w:hint="cs"/>
-          <w:rtl/>
-        </w:rPr>
-        <w:t xml:space="preserve"> יש לשנות ערכים עבור </w:t>
-      </w:r>
-      <w:r>
-        <w:rPr>
-          <w:rFonts w:ascii="David" w:eastAsia="Aptos" w:hAnsi="David" w:cs="David"/>
-        </w:rPr>
-        <w:t>DB</w:t>
-      </w:r>
-      <w:r>
-        <w:rPr>
-          <w:rFonts w:ascii="David" w:eastAsia="Aptos" w:hAnsi="David" w:cs="David" w:hint="cs"/>
-          <w:rtl/>
-        </w:rPr>
-        <w:t>:</w:t>
-      </w:r>
-    </w:p>
-    <w:p>
-      <w:pPr>
-        <w:bidi/>
-        <w:spacing w:line="276" w:lineRule="auto"/>
-        <w:rPr>
-          <w:rFonts w:ascii="David" w:eastAsia="Aptos" w:hAnsi="David" w:cs="David"/>
-        </w:rPr>
-      </w:pPr>
-      <w:r>
-        <w:rPr>
-          <w:rFonts w:ascii="David" w:eastAsia="Aptos" w:hAnsi="David" w:cs="David"/>
-        </w:rPr>
-        <w:t>POSTGRES_DB</w:t>
-      </w:r>
-    </w:p>
-    <w:p>
-      <w:pPr>
-        <w:bidi/>
-        <w:spacing w:line="276" w:lineRule="auto"/>
-        <w:rPr>
-          <w:rFonts w:ascii="David" w:eastAsia="Aptos" w:hAnsi="David" w:cs="David"/>
-          <w:rtl/>
-        </w:rPr>
-      </w:pPr>
-      <w:r>
-        <w:rPr>
-          <w:rFonts w:ascii="David" w:eastAsia="Aptos" w:hAnsi="David" w:cs="David"/>
-        </w:rPr>
-        <w:t>POSTGRES_PASSWORD</w:t>
-      </w:r>
-    </w:p>
-    <w:p>
-      <w:pPr>
-        <w:bidi/>
-        <w:spacing w:line="276" w:lineRule="auto"/>
-        <w:rPr>
-          <w:rFonts w:ascii="David" w:eastAsia="Aptos" w:hAnsi="David" w:cs="David"/>
-        </w:rPr>
-      </w:pPr>
-      <w:r>
-        <w:rPr>
-          <w:rFonts w:ascii="David" w:eastAsia="Aptos" w:hAnsi="David" w:cs="David"/>
-        </w:rPr>
-        <w:t>POSTGRES_USER</w:t>
-      </w:r>
-    </w:p>
-    <w:p>
-      <w:pPr>
-        <w:bidi/>
-        <w:spacing w:line="276" w:lineRule="auto"/>
-        <w:rPr>
-          <w:rFonts w:ascii="David" w:eastAsia="Aptos" w:hAnsi="David" w:cs="David"/>
-          <w:rtl/>
-        </w:rPr>
-      </w:pPr>
-      <w:r>
-        <w:rPr>
-          <w:rFonts w:ascii="David" w:eastAsia="Aptos" w:hAnsi="David" w:cs="David" w:hint="cs"/>
-          <w:rtl/>
-        </w:rPr>
-        <w:t>ערכים אלו הם שם ה</w:t>
-      </w:r>
-      <w:r>
-        <w:rPr>
-          <w:rFonts w:ascii="David" w:eastAsia="Aptos" w:hAnsi="David" w:cs="David"/>
-        </w:rPr>
-        <w:t>DB</w:t>
-      </w:r>
-      <w:r>
-        <w:rPr>
-          <w:rFonts w:ascii="David" w:eastAsia="Aptos" w:hAnsi="David" w:cs="David" w:hint="cs"/>
-          <w:rtl/>
-        </w:rPr>
-        <w:t xml:space="preserve"> ופרטי המשתמש לצורך גישה אליו שאיתו יעלה ה</w:t>
-      </w:r>
-      <w:r>
-        <w:rPr>
-          <w:rFonts w:ascii="David" w:eastAsia="Aptos" w:hAnsi="David" w:cs="David"/>
-        </w:rPr>
-        <w:t>DB</w:t>
-      </w:r>
-      <w:r>
-        <w:rPr>
-          <w:rFonts w:ascii="David" w:eastAsia="Aptos" w:hAnsi="David" w:cs="David" w:hint="cs"/>
-          <w:rtl/>
-        </w:rPr>
-        <w:t xml:space="preserve"> באמצעות ה</w:t>
-      </w:r>
-      <w:r>
-        <w:rPr>
-          <w:rFonts w:ascii="David" w:eastAsia="Aptos" w:hAnsi="David" w:cs="David"/>
-        </w:rPr>
-        <w:t>DOCKER</w:t>
-      </w:r>
-      <w:r>
-        <w:rPr>
-          <w:rFonts w:ascii="David" w:eastAsia="Aptos" w:hAnsi="David" w:cs="David" w:hint="cs"/>
-          <w:rtl/>
-        </w:rPr>
-        <w:t xml:space="preserve"> </w:t>
-      </w:r>
-      <w:r>
-        <w:rPr>
-          <w:rFonts w:ascii="David" w:eastAsia="Aptos" w:hAnsi="David" w:cs="David"/>
-          <w:rtl/>
-        </w:rPr>
-        <w:t>–</w:t>
-      </w:r>
-      <w:r>
-        <w:rPr>
-          <w:rFonts w:ascii="David" w:eastAsia="Aptos" w:hAnsi="David" w:cs="David" w:hint="cs"/>
-          <w:rtl/>
-        </w:rPr>
-        <w:t xml:space="preserve"> הגדרת </w:t>
-      </w:r>
-      <w:r>
-        <w:rPr>
-          <w:rFonts w:ascii="David" w:eastAsia="Aptos" w:hAnsi="David" w:cs="David"/>
-        </w:rPr>
-        <w:t>DB</w:t>
-      </w:r>
-      <w:r>
-        <w:rPr>
-          <w:rFonts w:ascii="David" w:eastAsia="Aptos" w:hAnsi="David" w:cs="David" w:hint="cs"/>
-          <w:rtl/>
-        </w:rPr>
-        <w:t>.</w:t>
-      </w:r>
-    </w:p>
-    <w:p>
-      <w:pPr>
-        <w:bidi/>
-        <w:spacing w:line="276" w:lineRule="auto"/>
-        <w:rPr>
-          <w:rFonts w:ascii="David" w:eastAsia="Aptos" w:hAnsi="David" w:cs="David"/>
-          <w:rtl/>
-        </w:rPr>
-      </w:pPr>
-    </w:p>
-    <w:p>
-      <w:pPr>
-        <w:bidi/>
-        <w:spacing w:line="276" w:lineRule="auto"/>
-        <w:rPr>
-          <w:rFonts w:ascii="David" w:eastAsia="Aptos" w:hAnsi="David" w:cs="David"/>
-          <w:rtl/>
-        </w:rPr>
-      </w:pPr>
-      <w:r>
-        <w:rPr>
-          <w:rFonts w:ascii="David" w:eastAsia="Aptos" w:hAnsi="David" w:cs="David" w:hint="cs"/>
-          <w:rtl/>
-        </w:rPr>
-        <w:lastRenderedPageBreak/>
-        <w:t xml:space="preserve">עבור </w:t>
-      </w:r>
-      <w:r>
-        <w:rPr>
-          <w:rFonts w:ascii="David" w:eastAsia="Aptos" w:hAnsi="David" w:cs="David"/>
-          <w:u w:val="single"/>
-        </w:rPr>
-        <w:t>frontend</w:t>
-      </w:r>
-      <w:r>
-        <w:rPr>
-          <w:rFonts w:ascii="David" w:eastAsia="Aptos" w:hAnsi="David" w:cs="David" w:hint="cs"/>
-          <w:rtl/>
-        </w:rPr>
-        <w:t xml:space="preserve"> אין צורך לשנות שום דבר</w:t>
-      </w:r>
-      <w:r>
-        <w:rPr>
-          <w:rFonts w:ascii="David" w:eastAsia="Aptos" w:hAnsi="David" w:cs="David" w:hint="cs"/>
-          <w:rtl/>
-        </w:rPr>
-        <w:t xml:space="preserve"> </w:t>
-      </w:r>
-      <w:r>
-        <w:rPr>
-          <w:rFonts w:ascii="David" w:eastAsia="Aptos" w:hAnsi="David" w:cs="David"/>
-          <w:rtl/>
-        </w:rPr>
-        <w:t>–</w:t>
-      </w:r>
-      <w:r>
-        <w:rPr>
-          <w:rFonts w:ascii="David" w:eastAsia="Aptos" w:hAnsi="David" w:cs="David" w:hint="cs"/>
-          <w:rtl/>
-        </w:rPr>
-        <w:t xml:space="preserve"> הכול כבר מותאם.</w:t>
-      </w:r>
-    </w:p>
-    <w:p>
-      <w:pPr>
-        <w:bidi/>
-        <w:spacing w:line="276" w:lineRule="auto"/>
-        <w:rPr>
-          <w:rFonts w:ascii="David" w:eastAsia="Aptos" w:hAnsi="David" w:cs="David"/>
-          <w:rtl/>
-        </w:rPr>
-      </w:pPr>
-      <w:r>
-        <w:rPr>
-          <w:rFonts w:ascii="David" w:eastAsia="Aptos" w:hAnsi="David" w:cs="David" w:hint="cs"/>
-          <w:rtl/>
-        </w:rPr>
-        <w:t xml:space="preserve">עבור </w:t>
-      </w:r>
-      <w:r>
-        <w:rPr>
-          <w:rFonts w:ascii="David" w:eastAsia="Aptos" w:hAnsi="David" w:cs="David"/>
-          <w:u w:val="single"/>
-        </w:rPr>
-        <w:t>backend</w:t>
-      </w:r>
-      <w:r>
-        <w:rPr>
-          <w:rFonts w:ascii="David" w:eastAsia="Aptos" w:hAnsi="David" w:cs="David" w:hint="cs"/>
-          <w:rtl/>
-        </w:rPr>
-        <w:t xml:space="preserve"> יש לשנות ערכים עבור </w:t>
-      </w:r>
-      <w:r>
-        <w:rPr>
-          <w:rFonts w:ascii="David" w:eastAsia="Aptos" w:hAnsi="David" w:cs="David"/>
-        </w:rPr>
-        <w:t>DB</w:t>
-      </w:r>
-      <w:r>
-        <w:rPr>
-          <w:rFonts w:ascii="David" w:eastAsia="Aptos" w:hAnsi="David" w:cs="David" w:hint="cs"/>
-          <w:rtl/>
-        </w:rPr>
-        <w:t>:</w:t>
-      </w:r>
-    </w:p>
-    <w:p>
-      <w:pPr>
-        <w:bidi/>
-        <w:spacing w:line="276" w:lineRule="auto"/>
-        <w:rPr>
-          <w:rFonts w:ascii="David" w:eastAsia="Aptos" w:hAnsi="David" w:cs="David"/>
-        </w:rPr>
-      </w:pPr>
-      <w:r>
-        <w:rPr>
-          <w:rFonts w:ascii="David" w:eastAsia="Aptos" w:hAnsi="David" w:cs="David"/>
-        </w:rPr>
-        <w:t>SPORTSHOP_DB_USER</w:t>
-      </w:r>
-    </w:p>
-    <w:p>
-      <w:pPr>
-        <w:bidi/>
-        <w:spacing w:line="276" w:lineRule="auto"/>
-        <w:rPr>
-          <w:rFonts w:ascii="David" w:eastAsia="Aptos" w:hAnsi="David" w:cs="David"/>
-        </w:rPr>
-      </w:pPr>
-      <w:r>
-        <w:rPr>
-          <w:rFonts w:ascii="David" w:eastAsia="Aptos" w:hAnsi="David" w:cs="David"/>
-        </w:rPr>
-        <w:t>SPORTSHOP_DB_PASSWORD</w:t>
-      </w:r>
-    </w:p>
-    <w:p>
-      <w:pPr>
-        <w:bidi/>
-        <w:spacing w:line="276" w:lineRule="auto"/>
-        <w:rPr>
-          <w:rFonts w:ascii="David" w:eastAsia="Aptos" w:hAnsi="David" w:cs="David"/>
-        </w:rPr>
-      </w:pPr>
-      <w:r>
-        <w:rPr>
-          <w:rFonts w:ascii="David" w:eastAsia="Aptos" w:hAnsi="David" w:cs="David"/>
-        </w:rPr>
-        <w:t>SPORTSHOP_DB_NAME</w:t>
-      </w:r>
-    </w:p>
-    <w:p>
-      <w:pPr>
-        <w:bidi/>
-        <w:spacing w:line="276" w:lineRule="auto"/>
-        <w:rPr>
-          <w:rFonts w:ascii="David" w:eastAsia="Aptos" w:hAnsi="David" w:cs="David"/>
-          <w:rtl/>
-        </w:rPr>
-      </w:pPr>
-      <w:r>
-        <w:rPr>
-          <w:rFonts w:ascii="David" w:eastAsia="Aptos" w:hAnsi="David" w:cs="David" w:hint="cs"/>
-          <w:rtl/>
-        </w:rPr>
-        <w:t>כך שיתאימו לערכים שקיימים ב</w:t>
-      </w:r>
-      <w:r>
-        <w:rPr>
-          <w:rFonts w:ascii="David" w:eastAsia="Aptos" w:hAnsi="David" w:cs="David"/>
-        </w:rPr>
-        <w:t>deploy</w:t>
-      </w:r>
-      <w:r>
-        <w:rPr>
-          <w:rFonts w:ascii="David" w:eastAsia="Aptos" w:hAnsi="David" w:cs="David" w:hint="cs"/>
-          <w:rtl/>
-        </w:rPr>
-        <w:t xml:space="preserve"> כדי שנוכל להתחבר בהצלחה</w:t>
-      </w:r>
-      <w:r>
-        <w:rPr>
-          <w:rFonts w:ascii="David" w:eastAsia="Aptos" w:hAnsi="David" w:cs="David" w:hint="cs"/>
-          <w:rtl/>
-        </w:rPr>
-        <w:t xml:space="preserve"> אל ה</w:t>
-      </w:r>
-      <w:r>
-        <w:rPr>
-          <w:rFonts w:ascii="David" w:eastAsia="Aptos" w:hAnsi="David" w:cs="David"/>
-        </w:rPr>
-        <w:t>DB</w:t>
-      </w:r>
-      <w:r>
-        <w:rPr>
-          <w:rFonts w:ascii="David" w:eastAsia="Aptos" w:hAnsi="David" w:cs="David" w:hint="cs"/>
-          <w:rtl/>
-        </w:rPr>
-        <w:t>.</w:t>
-      </w:r>
-      <w:r>
-        <w:rPr>
-          <w:rFonts w:ascii="David" w:eastAsia="Aptos" w:hAnsi="David" w:cs="David" w:hint="cs"/>
-          <w:rtl/>
-        </w:rPr>
-        <w:t xml:space="preserve"> שאר הערכים מותאמים כבר ואין צורך לשנותם.</w:t>
-      </w:r>
-    </w:p>
-    <w:p>
-      <w:pPr>
-        <w:bidi/>
-        <w:spacing w:line="276" w:lineRule="auto"/>
-        <w:rPr>
-          <w:rFonts w:ascii="David" w:eastAsia="Aptos" w:hAnsi="David" w:cs="David"/>
-          <w:rtl/>
-        </w:rPr>
-      </w:pPr>
-    </w:p>
-    <w:p>
-      <w:pPr>
-        <w:bidi/>
-        <w:spacing w:line="276" w:lineRule="auto"/>
-        <w:rPr>
-          <w:rFonts w:ascii="David" w:eastAsia="Aptos" w:hAnsi="David" w:cs="David"/>
-          <w:u w:val="single"/>
-          <w:rtl/>
-        </w:rPr>
-      </w:pPr>
-      <w:r>
-        <w:rPr>
-          <w:rFonts w:ascii="David" w:eastAsia="Aptos" w:hAnsi="David" w:cs="David" w:hint="cs"/>
-          <w:u w:val="single"/>
-          <w:rtl/>
-        </w:rPr>
-        <w:t>שלב 3:</w:t>
-      </w:r>
-    </w:p>
-    <w:p>
-      <w:pPr>
-        <w:bidi/>
-        <w:spacing w:line="276" w:lineRule="auto"/>
-        <w:rPr>
-          <w:rFonts w:ascii="David" w:eastAsia="Aptos" w:hAnsi="David" w:cs="David"/>
-          <w:rtl/>
-        </w:rPr>
-      </w:pPr>
-      <w:r>
-        <w:rPr>
-          <w:rFonts w:ascii="David" w:eastAsia="Aptos" w:hAnsi="David" w:cs="David" w:hint="cs"/>
-          <w:rtl/>
-        </w:rPr>
-        <w:t>יש להיכנס לתיקיית ה</w:t>
-      </w:r>
-      <w:r>
-        <w:rPr>
-          <w:rFonts w:ascii="David" w:eastAsia="Aptos" w:hAnsi="David" w:cs="David"/>
-        </w:rPr>
-        <w:t>deploy</w:t>
-      </w:r>
-      <w:r>
-        <w:rPr>
-          <w:rFonts w:ascii="David" w:eastAsia="Aptos" w:hAnsi="David" w:cs="David" w:hint="cs"/>
-          <w:rtl/>
-        </w:rPr>
-        <w:t xml:space="preserve"> ולהריץ את הפקודה: </w:t>
-      </w:r>
-    </w:p>
-    <w:p>
-      <w:pPr>
-        <w:bidi/>
-        <w:spacing w:line="276" w:lineRule="auto"/>
-        <w:jc w:val="right"/>
-        <w:rPr>
-          <w:rFonts w:ascii="David" w:eastAsia="Aptos" w:hAnsi="David" w:cs="David"/>
-        </w:rPr>
-      </w:pPr>
-      <w:r>
-        <w:rPr>
-          <w:rFonts w:ascii="David" w:eastAsia="Aptos" w:hAnsi="David" w:cs="David"/>
-        </w:rPr>
-        <w:t>docker compose up -d</w:t>
-      </w:r>
-    </w:p>
-    <w:p>
-      <w:pPr>
-        <w:bidi/>
-        <w:spacing w:line="276" w:lineRule="auto"/>
-        <w:rPr>
-          <w:rFonts w:ascii="David" w:eastAsia="Aptos" w:hAnsi="David" w:cs="David"/>
-          <w:rtl/>
-        </w:rPr>
-      </w:pPr>
-      <w:r>
-        <w:rPr>
-          <w:rFonts w:ascii="David" w:eastAsia="Aptos" w:hAnsi="David" w:cs="David" w:hint="cs"/>
-          <w:rtl/>
-        </w:rPr>
-        <w:t>צריך לחכות שהכול יעלה בהצלחה (</w:t>
-      </w:r>
-      <w:r>
-        <w:rPr>
-          <w:rFonts w:ascii="David" w:eastAsia="Aptos" w:hAnsi="David" w:cs="David"/>
-        </w:rPr>
-        <w:t>DB</w:t>
-      </w:r>
-      <w:r>
-        <w:rPr>
-          <w:rFonts w:ascii="David" w:eastAsia="Aptos" w:hAnsi="David" w:cs="David" w:hint="cs"/>
-          <w:rtl/>
-        </w:rPr>
-        <w:t xml:space="preserve"> בפעם הראשונה עשוי לקחת קצת זמן) </w:t>
-      </w:r>
-      <w:r>
-        <w:rPr>
-          <w:rFonts w:ascii="David" w:eastAsia="Aptos" w:hAnsi="David" w:cs="David"/>
-          <w:rtl/>
-        </w:rPr>
-        <w:t>–</w:t>
-      </w:r>
-      <w:r>
-        <w:rPr>
-          <w:rFonts w:ascii="David" w:eastAsia="Aptos" w:hAnsi="David" w:cs="David" w:hint="cs"/>
-          <w:rtl/>
-        </w:rPr>
-        <w:t xml:space="preserve"> אם נכשל עשוי להיות בגלל </w:t>
-      </w:r>
-      <w:r>
-        <w:rPr>
-          <w:rFonts w:ascii="David" w:eastAsia="Aptos" w:hAnsi="David" w:cs="David"/>
-        </w:rPr>
-        <w:t>HEALTHCHECKS</w:t>
-      </w:r>
-      <w:r>
-        <w:rPr>
-          <w:rFonts w:ascii="David" w:eastAsia="Aptos" w:hAnsi="David" w:cs="David" w:hint="cs"/>
-          <w:rtl/>
-        </w:rPr>
-        <w:t xml:space="preserve"> ויש להעלות ב</w:t>
-      </w:r>
-      <w:r>
-        <w:rPr>
-          <w:rFonts w:ascii="David" w:eastAsia="Aptos" w:hAnsi="David" w:cs="David"/>
-        </w:rPr>
-        <w:t>DOCKER COMPOSE</w:t>
-      </w:r>
-      <w:r>
-        <w:rPr>
-          <w:rFonts w:ascii="David" w:eastAsia="Aptos" w:hAnsi="David" w:cs="David" w:hint="cs"/>
-          <w:rtl/>
-        </w:rPr>
-        <w:t xml:space="preserve"> את הערכים הקשורים לבדיקות הללו.</w:t>
-      </w:r>
-    </w:p>
-    <w:p>
-      <w:pPr>
-        <w:bidi/>
-        <w:spacing w:line="276" w:lineRule="auto"/>
-        <w:rPr>
-          <w:rFonts w:ascii="David" w:eastAsia="Aptos" w:hAnsi="David" w:cs="David"/>
-          <w:rtl/>
-        </w:rPr>
-      </w:pPr>
-    </w:p>
-    <w:p>
-      <w:pPr>
-        <w:bidi/>
-        <w:spacing w:line="276" w:lineRule="auto"/>
-        <w:rPr>
-          <w:rFonts w:ascii="David" w:eastAsia="Aptos" w:hAnsi="David" w:cs="David"/>
-          <w:u w:val="single"/>
-        </w:rPr>
-      </w:pPr>
-      <w:r>
-        <w:rPr>
-          <w:rFonts w:ascii="David" w:eastAsia="Aptos" w:hAnsi="David" w:cs="David"/>
-          <w:u w:val="single"/>
-          <w:rtl/>
-        </w:rPr>
-        <w:t xml:space="preserve">שלב </w:t>
-      </w:r>
-      <w:r>
-        <w:rPr>
-          <w:rFonts w:ascii="David" w:eastAsia="Aptos" w:hAnsi="David" w:cs="David" w:hint="cs"/>
-          <w:u w:val="single"/>
-          <w:rtl/>
-        </w:rPr>
-        <w:t>4</w:t>
-      </w:r>
-      <w:r>
-        <w:rPr>
-          <w:rFonts w:ascii="David" w:eastAsia="Aptos" w:hAnsi="David" w:cs="David"/>
-          <w:u w:val="single"/>
-          <w:rtl/>
-        </w:rPr>
-        <w:t>:</w:t>
-      </w:r>
-    </w:p>
-    <w:p>
-      <w:pPr>
-        <w:bidi/>
-        <w:spacing w:line="276" w:lineRule="auto"/>
-        <w:rPr>
-          <w:rFonts w:ascii="David" w:eastAsia="Aptos" w:hAnsi="David" w:cs="David"/>
-          <w:rtl/>
-        </w:rPr>
-      </w:pPr>
-      <w:r>
-        <w:rPr>
-          <w:rFonts w:ascii="David" w:eastAsia="Aptos" w:hAnsi="David" w:cs="David" w:hint="cs"/>
-          <w:rtl/>
-        </w:rPr>
-        <w:t>יש לפתוח את הלינק הבא:</w:t>
-      </w:r>
-    </w:p>
-    <w:p>
-      <w:pPr>
-        <w:bidi/>
-        <w:spacing w:line="276" w:lineRule="auto"/>
-        <w:jc w:val="right"/>
-        <w:rPr>
-          <w:rFonts w:ascii="David" w:eastAsia="Aptos" w:hAnsi="David" w:cs="David" w:hint="cs"/>
-        </w:rPr>
-      </w:pPr>
-      <w:r>
-        <w:rPr>
-          <w:rFonts w:ascii="David" w:eastAsia="Aptos" w:hAnsi="David" w:cs="David"/>
-        </w:rPr>
-        <w:t>https://localhost:46443</w:t>
-      </w:r>
-    </w:p>
-    <w:p>
-      <w:pPr>
-        <w:bidi/>
-        <w:spacing w:line="276" w:lineRule="auto"/>
-        <w:rPr>
-          <w:rFonts w:ascii="David" w:eastAsia="Aptos" w:hAnsi="David" w:cs="David"/>
-          <w:rtl/>
-        </w:rPr>
-      </w:pPr>
-      <w:r>
-        <w:rPr>
-          <w:rFonts w:ascii="David" w:eastAsia="Aptos" w:hAnsi="David" w:cs="David" w:hint="cs"/>
-          <w:rtl/>
-        </w:rPr>
-        <w:t>ולהתחיל לעבוד עם האפליקציה.</w:t>
-      </w:r>
-    </w:p>
-    <w:p>
-      <w:pPr>
-        <w:bidi/>
-        <w:spacing w:line="276" w:lineRule="auto"/>
-        <w:rPr>
-          <w:rFonts w:ascii="David" w:eastAsia="Aptos" w:hAnsi="David" w:cs="David"/>
-          <w:rtl/>
-        </w:rPr>
-      </w:pPr>
-      <w:r>
-        <w:rPr>
-          <w:rFonts w:ascii="David" w:eastAsia="Aptos" w:hAnsi="David" w:cs="David" w:hint="cs"/>
-          <w:rtl/>
-        </w:rPr>
-        <w:t>בקובץ ה</w:t>
-      </w:r>
-      <w:r>
-        <w:rPr>
-          <w:rFonts w:ascii="David" w:eastAsia="Aptos" w:hAnsi="David" w:cs="David"/>
-        </w:rPr>
-        <w:t>DOCKER COMPOSE</w:t>
-      </w:r>
-      <w:r>
-        <w:rPr>
-          <w:rFonts w:ascii="David" w:eastAsia="Aptos" w:hAnsi="David" w:cs="David" w:hint="cs"/>
-          <w:rtl/>
-        </w:rPr>
-        <w:t xml:space="preserve"> יש מדריך בתחילתו כתוב כהערה במידה ורוצים להעלים את ההערה שקשורה ל</w:t>
-      </w:r>
-      <w:r>
-        <w:rPr>
-          <w:rFonts w:ascii="David" w:eastAsia="Aptos" w:hAnsi="David" w:cs="David"/>
-        </w:rPr>
-        <w:t>certs</w:t>
-      </w:r>
-      <w:r>
-        <w:rPr>
-          <w:rFonts w:ascii="David" w:eastAsia="Aptos" w:hAnsi="David" w:cs="David" w:hint="cs"/>
-          <w:rtl/>
-        </w:rPr>
-        <w:t>.</w:t>
-      </w:r>
-    </w:p>
-    <w:p>
-      <w:pPr>
-        <w:bidi/>
-        <w:spacing w:line="276" w:lineRule="auto"/>
-        <w:rPr>
-          <w:rFonts w:ascii="David" w:eastAsia="Aptos" w:hAnsi="David" w:cs="David"/>
-          <w:rtl/>
-        </w:rPr>
-      </w:pPr>
-    </w:p>
-    <w:p>
-      <w:pPr>
-        <w:bidi/>
-        <w:spacing w:line="276" w:lineRule="auto"/>
-        <w:rPr>
-          <w:rFonts w:ascii="David" w:eastAsia="Aptos" w:hAnsi="David" w:cs="David"/>
-          <w:rtl/>
-        </w:rPr>
-      </w:pPr>
-      <w:r>
-        <w:rPr>
-          <w:rFonts w:ascii="David" w:eastAsia="Aptos" w:hAnsi="David" w:cs="David" w:hint="cs"/>
-          <w:rtl/>
-        </w:rPr>
-        <w:t>כדי לסגור את הפרוייקט יש להריץ את הפקודה:</w:t>
-      </w:r>
-    </w:p>
-    <w:p>
-      <w:pPr>
-        <w:bidi/>
-        <w:spacing w:line="276" w:lineRule="auto"/>
-        <w:jc w:val="right"/>
-        <w:rPr>
-          <w:rFonts w:ascii="David" w:eastAsia="Aptos" w:hAnsi="David" w:cs="David"/>
-        </w:rPr>
-      </w:pPr>
-      <w:r>
-        <w:rPr>
-          <w:rFonts w:ascii="David" w:eastAsia="Aptos" w:hAnsi="David" w:cs="David"/>
-        </w:rPr>
-        <w:t xml:space="preserve">docker compose </w:t>
-      </w:r>
-      <w:r>
-        <w:rPr>
-          <w:rFonts w:ascii="David" w:eastAsia="Aptos" w:hAnsi="David" w:cs="David"/>
-        </w:rPr>
-        <w:t>down</w:t>
-      </w:r>
-    </w:p>
-    <w:p>
-      <w:pPr>
-        <w:bidi/>
-        <w:spacing w:line="276" w:lineRule="auto"/>
-        <w:jc w:val="right"/>
-        <w:rPr>
-          <w:rFonts w:ascii="David" w:eastAsia="Aptos" w:hAnsi="David" w:cs="David"/>
-        </w:rPr>
-      </w:pPr>
-    </w:p>
-    <w:p>
-      <w:pPr>
-        <w:bidi/>
-        <w:spacing w:line="276" w:lineRule="auto"/>
-        <w:jc w:val="right"/>
-        <w:rPr>
-          <w:rFonts w:ascii="David" w:eastAsia="Aptos" w:hAnsi="David" w:cs="David"/>
-        </w:rPr>
-      </w:pPr>
-    </w:p>
-    <w:p>
-      <w:pPr>
-        <w:bidi/>
-        <w:spacing w:line="276" w:lineRule="auto"/>
-        <w:jc w:val="right"/>
-        <w:rPr>
-          <w:rFonts w:ascii="David" w:eastAsia="Aptos" w:hAnsi="David" w:cs="David"/>
-        </w:rPr>
-      </w:pPr>
-    </w:p>
-    <w:p>
-      <w:pPr>
-        <w:bidi/>
-        <w:spacing w:line="276" w:lineRule="auto"/>
-        <w:jc w:val="right"/>
-        <w:rPr>
-          <w:rFonts w:ascii="David" w:eastAsia="Aptos" w:hAnsi="David" w:cs="David"/>
-        </w:rPr>
-      </w:pPr>
-    </w:p>
-    <w:p>
-      <w:pPr>
-        <w:bidi/>
-        <w:spacing w:line="276" w:lineRule="auto"/>
-        <w:jc w:val="right"/>
-        <w:rPr>
-          <w:rFonts w:ascii="David" w:eastAsia="Aptos" w:hAnsi="David" w:cs="David"/>
-        </w:rPr>
-      </w:pPr>
-    </w:p>
-    <w:p>
-      <w:pPr>
-        <w:bidi/>
-        <w:spacing w:line="276" w:lineRule="auto"/>
-        <w:jc w:val="right"/>
-        <w:rPr>
-          <w:rFonts w:ascii="David" w:eastAsia="Aptos" w:hAnsi="David" w:cs="David"/>
-        </w:rPr>
-      </w:pPr>
-    </w:p>
-    <w:p>
-      <w:pPr>
-        <w:bidi/>
-        <w:spacing w:line="276" w:lineRule="auto"/>
-        <w:jc w:val="right"/>
-        <w:rPr>
-          <w:rFonts w:ascii="David" w:eastAsia="Aptos" w:hAnsi="David" w:cs="David"/>
-        </w:rPr>
-      </w:pPr>
-    </w:p>
-    <w:p>
-      <w:pPr>
-        <w:bidi/>
-        <w:spacing w:line="276" w:lineRule="auto"/>
-        <w:jc w:val="right"/>
-        <w:rPr>
-          <w:rFonts w:ascii="David" w:eastAsia="Aptos" w:hAnsi="David" w:cs="David"/>
-        </w:rPr>
-      </w:pPr>
-    </w:p>
-    <w:p>
-      <w:pPr>
-        <w:bidi/>
-        <w:spacing w:line="276" w:lineRule="auto"/>
-        <w:rPr>
-          <w:rFonts w:ascii="David" w:eastAsia="Aptos" w:hAnsi="David" w:cs="David"/>
-          <w:b/>
-          <w:bCs/>
-          <w:sz w:val="32"/>
-          <w:szCs w:val="32"/>
-          <w:u w:val="single"/>
-        </w:rPr>
-      </w:pPr>
-      <w:r>
-        <w:rPr>
-          <w:rFonts w:ascii="David" w:eastAsia="Aptos" w:hAnsi="David" w:cs="David"/>
-          <w:b/>
-          <w:bCs/>
-          <w:sz w:val="32"/>
-          <w:szCs w:val="32"/>
-          <w:u w:val="single"/>
-          <w:rtl/>
-        </w:rPr>
-        <w:lastRenderedPageBreak/>
         <w:t xml:space="preserve">מסלול </w:t>
       </w:r>
       <w:r>
@@ -4563,6 +4647,7 @@
   <w:style w:type="character" w:default="1" w:styleId="DefaultParagraphFont">
     <w:name w:val="Default Paragraph Font"/>
     <w:uiPriority w:val="1"/>
+    <w:semiHidden/>
     <w:unhideWhenUsed/>
   </w:style>
   <w:style w:type="table" w:default="1" w:styleId="TableNormal">

</xml_diff>